<commit_message>
Align thesis with KNU FCSC methodology requirements
- References renumbered by order of first citation in text (ДСТУ §2.8);
  list reordered to match; dropped uncited ДСТУ entry (27 sources, all cited).
- Multiple in-text citations now separated by ";" (§3.15).
- Figure/table captions use "—" (тире) per §3.7/§3.8; table caption indented.
- Вступ restructured with the methodology's bold lead-in aspects in order
  (оцінка стану, актуальність, мета й завдання, об'єкт/методи, новизна,
  сфери застосування, взаємозв'язок); kept under 3 pages (§2 СТРУКТУРА).
- Keywords and abbreviations ordered alphabetically (Ukrainian → Latin)
  per §2.2/§2.4; abbreviation descriptions after "—".
- Replaced running-text math signs (macro-F1 value in apposition) per §3.6.

https://claude.ai/code/session_01S5qNwg7X8K6zJLh7vUsNoh
</commit_message>
<xml_diff>
--- a/thesis/Кваліфікаційна_робота_Макаренко.docx
+++ b/thesis/Кваліфікаційна_робота_Макаренко.docx
@@ -387,7 +387,7 @@
           <w:i w:val="0"/>
           <w:sz w:val="28"/>
         </w:rPr>
-        <w:t>Обсяг роботи становить 50 сторінок основного тексту, робота містить 21 рисунок, 8 таблиць і 28 джерел посилання.</w:t>
+        <w:t>Обсяг роботи становить 50 сторінок основного тексту, робота містить 21 рисунок, 8 таблиць і 27 джерел посилання.</w:t>
       </w:r>
     </w:p>
     <w:p>
@@ -403,7 +403,7 @@
           <w:i w:val="0"/>
           <w:sz w:val="28"/>
         </w:rPr>
-        <w:t>ЕЛЕКТРОКАРДІОГРАФІЯ, КЛАСИФІКАЦІЯ СЕРЦЕВИХ СКОРОЧЕНЬ, АРИТМІЯ, МАШИННЕ НАВЧАННЯ, ЗГОРТКОВА НЕЙРОННА МЕРЕЖА, ГРАДІЄНТНИЙ БУСТИНГ, ГІБРИДНИЙ КЛАСИФІКАТОР, MIT-BIH, СТАНДАРТ AAMI, БАГАТОФОРМАТНА ОБРОБКА, ДЕТЕКЦІЯ R-ПІКІВ, PYTHON.</w:t>
+        <w:t>АРИТМІЯ, БАГАТОФОРМАТНА ОБРОБКА, ГІБРИДНИЙ КЛАСИФІКАТОР, ГРАДІЄНТНИЙ БУСТИНГ, ДЕТЕКЦІЯ R-ПІКІВ, ЕЛЕКТРОКАРДІОГРАФІЯ, ЗГОРТКОВА НЕЙРОННА МЕРЕЖА, КЛАСИФІКАЦІЯ СЕРЦЕВИХ СКОРОЧЕНЬ, МАШИННЕ НАВЧАННЯ, СТАНДАРТ AAMI, MIT-BIH, PYTHON.</w:t>
       </w:r>
     </w:p>
     <w:p>
@@ -483,7 +483,7 @@
           <w:i w:val="0"/>
           <w:sz w:val="28"/>
         </w:rPr>
-        <w:t>Результати роботи. Монолітний прототип, успадкований від попередньої курсової роботи, переструктуровано в модульний пакет ekg із розділенням шарів зчитування форматів, обробки сигналу, виділення ознак, моделей і сервісів. Реалізовано повний конвеєр навчання та оцінювання на базі MIT-BIH Arrhythmia Database за міжпацієнтним поділом DS1/DS2. Навчено й порівняно сім моделей; найкращий збалансований показник macro-F1 = 0,466 досягнуто методом опорних векторів на двовідвідних ознаках. Запропоновано дві наукові новизни: двопотоковий гібридний класифікатор із пізнім злиттям, що забезпечує найвищу чутливість до зливних скорочень (повнота 0,89), та бенчмарк багатоформатної стійкості, який доводить, що перетворення сигналу через формати CSV і EDF не погіршує якість класифікації (узгодженість міток 100 % для CSV і не менше 99,3 % для EDF). Систему доповнено REST-API та інтерфейсом командного рядка.</w:t>
+        <w:t>Результати роботи. Монолітний прототип, успадкований від попередньої курсової роботи, переструктуровано в модульний пакет ekg із розділенням шарів зчитування форматів, обробки сигналу, виділення ознак, моделей і сервісів. Реалізовано повний конвеєр навчання та оцінювання на базі MIT-BIH Arrhythmia Database за міжпацієнтним поділом DS1/DS2. Навчено й порівняно сім моделей; найкращий збалансований показник macro-F1 0,466 досягнуто методом опорних векторів на двовідвідних ознаках. Запропоновано дві наукові новизни: двопотоковий гібридний класифікатор із пізнім злиттям, що забезпечує найвищу чутливість до зливних скорочень (повнота 0,89), та бенчмарк багатоформатної стійкості, який доводить, що перетворення сигналу через формати CSV і EDF не погіршує якість класифікації (узгодженість міток 100 % для CSV і не менше 99,3 % для EDF). Систему доповнено REST-API та інтерфейсом командного рядка.</w:t>
       </w:r>
     </w:p>
     <w:p>
@@ -528,9 +528,67 @@
       <w:r>
         <w:rPr>
           <w:rFonts w:ascii="Times New Roman" w:hAnsi="Times New Roman" w:cs="Times New Roman"/>
+          <w:b w:val="0"/>
+          <w:i w:val="0"/>
           <w:sz w:val="28"/>
         </w:rPr>
-        <w:t>ЕКГ — електрокардіограма (електрокардіографія);</w:t>
+        <w:t>Перелік подано за абеткою: спочатку скорочення українською абеткою, потім латинською.</w:t>
+      </w:r>
+    </w:p>
+    <w:p>
+      <w:pPr>
+        <w:spacing w:line="360" w:lineRule="auto" w:after="0"/>
+        <w:ind w:firstLine="720"/>
+        <w:jc w:val="both"/>
+      </w:pPr>
+      <w:r>
+        <w:rPr>
+          <w:rFonts w:ascii="Times New Roman" w:hAnsi="Times New Roman" w:cs="Times New Roman"/>
+          <w:sz w:val="28"/>
+        </w:rPr>
+        <w:t>ВСР — варіабельність серцевого ритму (heart rate variability, HRV);</w:t>
+      </w:r>
+    </w:p>
+    <w:p>
+      <w:pPr>
+        <w:spacing w:line="360" w:lineRule="auto" w:after="0"/>
+        <w:ind w:firstLine="720"/>
+        <w:jc w:val="both"/>
+      </w:pPr>
+      <w:r>
+        <w:rPr>
+          <w:rFonts w:ascii="Times New Roman" w:hAnsi="Times New Roman" w:cs="Times New Roman"/>
+          <w:sz w:val="28"/>
+        </w:rPr>
+        <w:t>ЕКГ — електрокардіограма, електрокардіографія;</w:t>
+      </w:r>
+    </w:p>
+    <w:p>
+      <w:pPr>
+        <w:spacing w:line="360" w:lineRule="auto" w:after="0"/>
+        <w:ind w:firstLine="720"/>
+        <w:jc w:val="both"/>
+      </w:pPr>
+      <w:r>
+        <w:rPr>
+          <w:rFonts w:ascii="Times New Roman" w:hAnsi="Times New Roman" w:cs="Times New Roman"/>
+          <w:sz w:val="28"/>
+        </w:rPr>
+        <w:t>МН — машинне навчання;</w:t>
+      </w:r>
+    </w:p>
+    <w:p>
+      <w:pPr>
+        <w:spacing w:line="360" w:lineRule="auto" w:after="0"/>
+        <w:ind w:firstLine="720"/>
+        <w:jc w:val="both"/>
+      </w:pPr>
+      <w:r>
+        <w:rPr>
+          <w:rFonts w:ascii="Times New Roman" w:hAnsi="Times New Roman" w:cs="Times New Roman"/>
+          <w:sz w:val="28"/>
+        </w:rPr>
+        <w:t>ПЗ — програмне забезпечення;</w:t>
       </w:r>
     </w:p>
     <w:p>
@@ -558,7 +616,217 @@
           <w:rFonts w:ascii="Times New Roman" w:hAnsi="Times New Roman" w:cs="Times New Roman"/>
           <w:sz w:val="28"/>
         </w:rPr>
-        <w:t>ВСР (HRV) — варіабельність серцевого ритму (heart rate variability);</w:t>
+        <w:t>AAMI — Association for the Advancement of Medical Instrumentation;</w:t>
+      </w:r>
+    </w:p>
+    <w:p>
+      <w:pPr>
+        <w:spacing w:line="360" w:lineRule="auto" w:after="0"/>
+        <w:ind w:firstLine="720"/>
+        <w:jc w:val="both"/>
+      </w:pPr>
+      <w:r>
+        <w:rPr>
+          <w:rFonts w:ascii="Times New Roman" w:hAnsi="Times New Roman" w:cs="Times New Roman"/>
+          <w:sz w:val="28"/>
+        </w:rPr>
+        <w:t>API — програмний інтерфейс застосунку (application programming interface);</w:t>
+      </w:r>
+    </w:p>
+    <w:p>
+      <w:pPr>
+        <w:spacing w:line="360" w:lineRule="auto" w:after="0"/>
+        <w:ind w:firstLine="720"/>
+        <w:jc w:val="both"/>
+      </w:pPr>
+      <w:r>
+        <w:rPr>
+          <w:rFonts w:ascii="Times New Roman" w:hAnsi="Times New Roman" w:cs="Times New Roman"/>
+          <w:sz w:val="28"/>
+        </w:rPr>
+        <w:t>AUC — площа під ROC-кривою (area under curve);</w:t>
+      </w:r>
+    </w:p>
+    <w:p>
+      <w:pPr>
+        <w:spacing w:line="360" w:lineRule="auto" w:after="0"/>
+        <w:ind w:firstLine="720"/>
+        <w:jc w:val="both"/>
+      </w:pPr>
+      <w:r>
+        <w:rPr>
+          <w:rFonts w:ascii="Times New Roman" w:hAnsi="Times New Roman" w:cs="Times New Roman"/>
+          <w:sz w:val="28"/>
+        </w:rPr>
+        <w:t>BiLSTM — двонапрямлена довга короткочасна пам’ять (bidirectional long short-term memory);</w:t>
+      </w:r>
+    </w:p>
+    <w:p>
+      <w:pPr>
+        <w:spacing w:line="360" w:lineRule="auto" w:after="0"/>
+        <w:ind w:firstLine="720"/>
+        <w:jc w:val="both"/>
+      </w:pPr>
+      <w:r>
+        <w:rPr>
+          <w:rFonts w:ascii="Times New Roman" w:hAnsi="Times New Roman" w:cs="Times New Roman"/>
+          <w:sz w:val="28"/>
+        </w:rPr>
+        <w:t>BN — пакетна нормалізація (batch normalization);</w:t>
+      </w:r>
+    </w:p>
+    <w:p>
+      <w:pPr>
+        <w:spacing w:line="360" w:lineRule="auto" w:after="0"/>
+        <w:ind w:firstLine="720"/>
+        <w:jc w:val="both"/>
+      </w:pPr>
+      <w:r>
+        <w:rPr>
+          <w:rFonts w:ascii="Times New Roman" w:hAnsi="Times New Roman" w:cs="Times New Roman"/>
+          <w:sz w:val="28"/>
+        </w:rPr>
+        <w:t>CLI — інтерфейс командного рядка (command-line interface);</w:t>
+      </w:r>
+    </w:p>
+    <w:p>
+      <w:pPr>
+        <w:spacing w:line="360" w:lineRule="auto" w:after="0"/>
+        <w:ind w:firstLine="720"/>
+        <w:jc w:val="both"/>
+      </w:pPr>
+      <w:r>
+        <w:rPr>
+          <w:rFonts w:ascii="Times New Roman" w:hAnsi="Times New Roman" w:cs="Times New Roman"/>
+          <w:sz w:val="28"/>
+        </w:rPr>
+        <w:t>CNN — згорткова нейронна мережа (convolutional neural network);</w:t>
+      </w:r>
+    </w:p>
+    <w:p>
+      <w:pPr>
+        <w:spacing w:line="360" w:lineRule="auto" w:after="0"/>
+        <w:ind w:firstLine="720"/>
+        <w:jc w:val="both"/>
+      </w:pPr>
+      <w:r>
+        <w:rPr>
+          <w:rFonts w:ascii="Times New Roman" w:hAnsi="Times New Roman" w:cs="Times New Roman"/>
+          <w:sz w:val="28"/>
+        </w:rPr>
+        <w:t>DICOM — Digital Imaging and Communications in Medicine;</w:t>
+      </w:r>
+    </w:p>
+    <w:p>
+      <w:pPr>
+        <w:spacing w:line="360" w:lineRule="auto" w:after="0"/>
+        <w:ind w:firstLine="720"/>
+        <w:jc w:val="both"/>
+      </w:pPr>
+      <w:r>
+        <w:rPr>
+          <w:rFonts w:ascii="Times New Roman" w:hAnsi="Times New Roman" w:cs="Times New Roman"/>
+          <w:sz w:val="28"/>
+        </w:rPr>
+        <w:t>DS1, DS2 — навчальна та тестова підмножини записів MIT-BIH за міжпацієнтним поділом de Chazal;</w:t>
+      </w:r>
+    </w:p>
+    <w:p>
+      <w:pPr>
+        <w:spacing w:line="360" w:lineRule="auto" w:after="0"/>
+        <w:ind w:firstLine="720"/>
+        <w:jc w:val="both"/>
+      </w:pPr>
+      <w:r>
+        <w:rPr>
+          <w:rFonts w:ascii="Times New Roman" w:hAnsi="Times New Roman" w:cs="Times New Roman"/>
+          <w:sz w:val="28"/>
+        </w:rPr>
+        <w:t>DWT — дискретне вейвлет-перетворення (discrete wavelet transform);</w:t>
+      </w:r>
+    </w:p>
+    <w:p>
+      <w:pPr>
+        <w:spacing w:line="360" w:lineRule="auto" w:after="0"/>
+        <w:ind w:firstLine="720"/>
+        <w:jc w:val="both"/>
+      </w:pPr>
+      <w:r>
+        <w:rPr>
+          <w:rFonts w:ascii="Times New Roman" w:hAnsi="Times New Roman" w:cs="Times New Roman"/>
+          <w:sz w:val="28"/>
+        </w:rPr>
+        <w:t>EDF/BDF — European Data Format / BioSemi Data Format;</w:t>
+      </w:r>
+    </w:p>
+    <w:p>
+      <w:pPr>
+        <w:spacing w:line="360" w:lineRule="auto" w:after="0"/>
+        <w:ind w:firstLine="720"/>
+        <w:jc w:val="both"/>
+      </w:pPr>
+      <w:r>
+        <w:rPr>
+          <w:rFonts w:ascii="Times New Roman" w:hAnsi="Times New Roman" w:cs="Times New Roman"/>
+          <w:sz w:val="28"/>
+        </w:rPr>
+        <w:t>F1 — гармонічне середнє точності та повноти;</w:t>
+      </w:r>
+    </w:p>
+    <w:p>
+      <w:pPr>
+        <w:spacing w:line="360" w:lineRule="auto" w:after="0"/>
+        <w:ind w:firstLine="720"/>
+        <w:jc w:val="both"/>
+      </w:pPr>
+      <w:r>
+        <w:rPr>
+          <w:rFonts w:ascii="Times New Roman" w:hAnsi="Times New Roman" w:cs="Times New Roman"/>
+          <w:sz w:val="28"/>
+        </w:rPr>
+        <w:t>GAP — глобальне середнє агрегування (global average pooling);</w:t>
+      </w:r>
+    </w:p>
+    <w:p>
+      <w:pPr>
+        <w:spacing w:line="360" w:lineRule="auto" w:after="0"/>
+        <w:ind w:firstLine="720"/>
+        <w:jc w:val="both"/>
+      </w:pPr>
+      <w:r>
+        <w:rPr>
+          <w:rFonts w:ascii="Times New Roman" w:hAnsi="Times New Roman" w:cs="Times New Roman"/>
+          <w:sz w:val="28"/>
+        </w:rPr>
+        <w:t>HL7 aECG — annotated ECG у стандарті Health Level Seven;</w:t>
+      </w:r>
+    </w:p>
+    <w:p>
+      <w:pPr>
+        <w:spacing w:line="360" w:lineRule="auto" w:after="0"/>
+        <w:ind w:firstLine="720"/>
+        <w:jc w:val="both"/>
+      </w:pPr>
+      <w:r>
+        <w:rPr>
+          <w:rFonts w:ascii="Times New Roman" w:hAnsi="Times New Roman" w:cs="Times New Roman"/>
+          <w:sz w:val="28"/>
+        </w:rPr>
+        <w:t>macro-F1 — усереднена за класами міра F1;</w:t>
+      </w:r>
+    </w:p>
+    <w:p>
+      <w:pPr>
+        <w:spacing w:line="360" w:lineRule="auto" w:after="0"/>
+        <w:ind w:firstLine="720"/>
+        <w:jc w:val="both"/>
+      </w:pPr>
+      <w:r>
+        <w:rPr>
+          <w:rFonts w:ascii="Times New Roman" w:hAnsi="Times New Roman" w:cs="Times New Roman"/>
+          <w:sz w:val="28"/>
+        </w:rPr>
+        <w:t>N, S, V, F, Q — суперкласи серцевих скорочень за стандартом AAMI EC57 (нормальні, надшлуночкові ектопічні, шлуночкові ектопічні, зливні, невизначені);</w:t>
       </w:r>
     </w:p>
     <w:p>
@@ -586,7 +854,7 @@
           <w:rFonts w:ascii="Times New Roman" w:hAnsi="Times New Roman" w:cs="Times New Roman"/>
           <w:sz w:val="28"/>
         </w:rPr>
-        <w:t>RR — інтервал між двома сусідніми R-піками;</w:t>
+        <w:t>ReLU — випрямлена лінійна функція активації (rectified linear unit);</w:t>
       </w:r>
     </w:p>
     <w:p>
@@ -600,7 +868,7 @@
           <w:rFonts w:ascii="Times New Roman" w:hAnsi="Times New Roman" w:cs="Times New Roman"/>
           <w:sz w:val="28"/>
         </w:rPr>
-        <w:t>МН — машинне навчання;</w:t>
+        <w:t>REST — representational state transfer;</w:t>
       </w:r>
     </w:p>
     <w:p>
@@ -614,7 +882,7 @@
           <w:rFonts w:ascii="Times New Roman" w:hAnsi="Times New Roman" w:cs="Times New Roman"/>
           <w:sz w:val="28"/>
         </w:rPr>
-        <w:t>ПЗ — програмне забезпечення;</w:t>
+        <w:t>RF — випадковий ліс (random forest);</w:t>
       </w:r>
     </w:p>
     <w:p>
@@ -628,7 +896,7 @@
           <w:rFonts w:ascii="Times New Roman" w:hAnsi="Times New Roman" w:cs="Times New Roman"/>
           <w:sz w:val="28"/>
         </w:rPr>
-        <w:t>AAMI — Association for the Advancement of Medical Instrumentation;</w:t>
+        <w:t>ROC — характеристична крива виявлення (receiver operating characteristic);</w:t>
       </w:r>
     </w:p>
     <w:p>
@@ -642,7 +910,7 @@
           <w:rFonts w:ascii="Times New Roman" w:hAnsi="Times New Roman" w:cs="Times New Roman"/>
           <w:sz w:val="28"/>
         </w:rPr>
-        <w:t>N, S, V, F, Q — суперкласи серцевих скорочень за стандартом AAMI EC57 (нормальні, надшлуночкові ектопічні, шлуночкові ектопічні, зливні, невизначені);</w:t>
+        <w:t>RR — інтервал між двома сусідніми R-піками;</w:t>
       </w:r>
     </w:p>
     <w:p>
@@ -656,21 +924,7 @@
           <w:rFonts w:ascii="Times New Roman" w:hAnsi="Times New Roman" w:cs="Times New Roman"/>
           <w:sz w:val="28"/>
         </w:rPr>
-        <w:t>CNN — згорткова нейронна мережа (convolutional neural network);</w:t>
-      </w:r>
-    </w:p>
-    <w:p>
-      <w:pPr>
-        <w:spacing w:line="360" w:lineRule="auto" w:after="0"/>
-        <w:ind w:firstLine="720"/>
-        <w:jc w:val="both"/>
-      </w:pPr>
-      <w:r>
-        <w:rPr>
-          <w:rFonts w:ascii="Times New Roman" w:hAnsi="Times New Roman" w:cs="Times New Roman"/>
-          <w:sz w:val="28"/>
-        </w:rPr>
-        <w:t>BiLSTM — двонапрямлена довга короткочасна пам’ять (bidirectional long short-term memory);</w:t>
+        <w:t>SCP-ECG — Standard Communication Protocol for computer-assisted electrocardiography (EN 1064);</w:t>
       </w:r>
     </w:p>
     <w:p>
@@ -698,7 +952,7 @@
           <w:rFonts w:ascii="Times New Roman" w:hAnsi="Times New Roman" w:cs="Times New Roman"/>
           <w:sz w:val="28"/>
         </w:rPr>
-        <w:t>RF — випадковий ліс (random forest);</w:t>
+        <w:t>WFDB — формат і бібліотека PhysioNet (WaveForm DataBase);</w:t>
       </w:r>
     </w:p>
     <w:p>
@@ -712,217 +966,7 @@
           <w:rFonts w:ascii="Times New Roman" w:hAnsi="Times New Roman" w:cs="Times New Roman"/>
           <w:sz w:val="28"/>
         </w:rPr>
-        <w:t>XGBoost — бібліотека градієнтного бустингу дерев рішень;</w:t>
-      </w:r>
-    </w:p>
-    <w:p>
-      <w:pPr>
-        <w:spacing w:line="360" w:lineRule="auto" w:after="0"/>
-        <w:ind w:firstLine="720"/>
-        <w:jc w:val="both"/>
-      </w:pPr>
-      <w:r>
-        <w:rPr>
-          <w:rFonts w:ascii="Times New Roman" w:hAnsi="Times New Roman" w:cs="Times New Roman"/>
-          <w:sz w:val="28"/>
-        </w:rPr>
-        <w:t>DWT — дискретне вейвлет-перетворення (discrete wavelet transform);</w:t>
-      </w:r>
-    </w:p>
-    <w:p>
-      <w:pPr>
-        <w:spacing w:line="360" w:lineRule="auto" w:after="0"/>
-        <w:ind w:firstLine="720"/>
-        <w:jc w:val="both"/>
-      </w:pPr>
-      <w:r>
-        <w:rPr>
-          <w:rFonts w:ascii="Times New Roman" w:hAnsi="Times New Roman" w:cs="Times New Roman"/>
-          <w:sz w:val="28"/>
-        </w:rPr>
-        <w:t>GAP — глобальне середнє агрегування (global average pooling);</w:t>
-      </w:r>
-    </w:p>
-    <w:p>
-      <w:pPr>
-        <w:spacing w:line="360" w:lineRule="auto" w:after="0"/>
-        <w:ind w:firstLine="720"/>
-        <w:jc w:val="both"/>
-      </w:pPr>
-      <w:r>
-        <w:rPr>
-          <w:rFonts w:ascii="Times New Roman" w:hAnsi="Times New Roman" w:cs="Times New Roman"/>
-          <w:sz w:val="28"/>
-        </w:rPr>
-        <w:t>BN — пакетна нормалізація (batch normalization);</w:t>
-      </w:r>
-    </w:p>
-    <w:p>
-      <w:pPr>
-        <w:spacing w:line="360" w:lineRule="auto" w:after="0"/>
-        <w:ind w:firstLine="720"/>
-        <w:jc w:val="both"/>
-      </w:pPr>
-      <w:r>
-        <w:rPr>
-          <w:rFonts w:ascii="Times New Roman" w:hAnsi="Times New Roman" w:cs="Times New Roman"/>
-          <w:sz w:val="28"/>
-        </w:rPr>
-        <w:t>ReLU — випрямлена лінійна функція активації (rectified linear unit);</w:t>
-      </w:r>
-    </w:p>
-    <w:p>
-      <w:pPr>
-        <w:spacing w:line="360" w:lineRule="auto" w:after="0"/>
-        <w:ind w:firstLine="720"/>
-        <w:jc w:val="both"/>
-      </w:pPr>
-      <w:r>
-        <w:rPr>
-          <w:rFonts w:ascii="Times New Roman" w:hAnsi="Times New Roman" w:cs="Times New Roman"/>
-          <w:sz w:val="28"/>
-        </w:rPr>
-        <w:t>ROC — характеристична крива виявлення (receiver operating characteristic);</w:t>
-      </w:r>
-    </w:p>
-    <w:p>
-      <w:pPr>
-        <w:spacing w:line="360" w:lineRule="auto" w:after="0"/>
-        <w:ind w:firstLine="720"/>
-        <w:jc w:val="both"/>
-      </w:pPr>
-      <w:r>
-        <w:rPr>
-          <w:rFonts w:ascii="Times New Roman" w:hAnsi="Times New Roman" w:cs="Times New Roman"/>
-          <w:sz w:val="28"/>
-        </w:rPr>
-        <w:t>AUC — площа під ROC-кривою (area under curve);</w:t>
-      </w:r>
-    </w:p>
-    <w:p>
-      <w:pPr>
-        <w:spacing w:line="360" w:lineRule="auto" w:after="0"/>
-        <w:ind w:firstLine="720"/>
-        <w:jc w:val="both"/>
-      </w:pPr>
-      <w:r>
-        <w:rPr>
-          <w:rFonts w:ascii="Times New Roman" w:hAnsi="Times New Roman" w:cs="Times New Roman"/>
-          <w:sz w:val="28"/>
-        </w:rPr>
-        <w:t>F1 — гармонічне середнє точності та повноти;</w:t>
-      </w:r>
-    </w:p>
-    <w:p>
-      <w:pPr>
-        <w:spacing w:line="360" w:lineRule="auto" w:after="0"/>
-        <w:ind w:firstLine="720"/>
-        <w:jc w:val="both"/>
-      </w:pPr>
-      <w:r>
-        <w:rPr>
-          <w:rFonts w:ascii="Times New Roman" w:hAnsi="Times New Roman" w:cs="Times New Roman"/>
-          <w:sz w:val="28"/>
-        </w:rPr>
-        <w:t>macro-F1 — усереднена за класами міра F1;</w:t>
-      </w:r>
-    </w:p>
-    <w:p>
-      <w:pPr>
-        <w:spacing w:line="360" w:lineRule="auto" w:after="0"/>
-        <w:ind w:firstLine="720"/>
-        <w:jc w:val="both"/>
-      </w:pPr>
-      <w:r>
-        <w:rPr>
-          <w:rFonts w:ascii="Times New Roman" w:hAnsi="Times New Roman" w:cs="Times New Roman"/>
-          <w:sz w:val="28"/>
-        </w:rPr>
-        <w:t>DS1, DS2 — навчальна та тестова підмножини записів MIT-BIH за міжпацієнтним поділом de Chazal;</w:t>
-      </w:r>
-    </w:p>
-    <w:p>
-      <w:pPr>
-        <w:spacing w:line="360" w:lineRule="auto" w:after="0"/>
-        <w:ind w:firstLine="720"/>
-        <w:jc w:val="both"/>
-      </w:pPr>
-      <w:r>
-        <w:rPr>
-          <w:rFonts w:ascii="Times New Roman" w:hAnsi="Times New Roman" w:cs="Times New Roman"/>
-          <w:sz w:val="28"/>
-        </w:rPr>
-        <w:t>WFDB — формат і бібліотека PhysioNet (WaveForm DataBase);</w:t>
-      </w:r>
-    </w:p>
-    <w:p>
-      <w:pPr>
-        <w:spacing w:line="360" w:lineRule="auto" w:after="0"/>
-        <w:ind w:firstLine="720"/>
-        <w:jc w:val="both"/>
-      </w:pPr>
-      <w:r>
-        <w:rPr>
-          <w:rFonts w:ascii="Times New Roman" w:hAnsi="Times New Roman" w:cs="Times New Roman"/>
-          <w:sz w:val="28"/>
-        </w:rPr>
-        <w:t>EDF/BDF — European Data Format / BioSemi Data Format;</w:t>
-      </w:r>
-    </w:p>
-    <w:p>
-      <w:pPr>
-        <w:spacing w:line="360" w:lineRule="auto" w:after="0"/>
-        <w:ind w:firstLine="720"/>
-        <w:jc w:val="both"/>
-      </w:pPr>
-      <w:r>
-        <w:rPr>
-          <w:rFonts w:ascii="Times New Roman" w:hAnsi="Times New Roman" w:cs="Times New Roman"/>
-          <w:sz w:val="28"/>
-        </w:rPr>
-        <w:t>DICOM — Digital Imaging and Communications in Medicine;</w:t>
-      </w:r>
-    </w:p>
-    <w:p>
-      <w:pPr>
-        <w:spacing w:line="360" w:lineRule="auto" w:after="0"/>
-        <w:ind w:firstLine="720"/>
-        <w:jc w:val="both"/>
-      </w:pPr>
-      <w:r>
-        <w:rPr>
-          <w:rFonts w:ascii="Times New Roman" w:hAnsi="Times New Roman" w:cs="Times New Roman"/>
-          <w:sz w:val="28"/>
-        </w:rPr>
-        <w:t>HL7 aECG — annotated ECG у стандарті Health Level Seven;</w:t>
-      </w:r>
-    </w:p>
-    <w:p>
-      <w:pPr>
-        <w:spacing w:line="360" w:lineRule="auto" w:after="0"/>
-        <w:ind w:firstLine="720"/>
-        <w:jc w:val="both"/>
-      </w:pPr>
-      <w:r>
-        <w:rPr>
-          <w:rFonts w:ascii="Times New Roman" w:hAnsi="Times New Roman" w:cs="Times New Roman"/>
-          <w:sz w:val="28"/>
-        </w:rPr>
-        <w:t>SCP-ECG — Standard Communication Protocol for computer-assisted electrocardiography (EN 1064);</w:t>
-      </w:r>
-    </w:p>
-    <w:p>
-      <w:pPr>
-        <w:spacing w:line="360" w:lineRule="auto" w:after="0"/>
-        <w:ind w:firstLine="720"/>
-        <w:jc w:val="both"/>
-      </w:pPr>
-      <w:r>
-        <w:rPr>
-          <w:rFonts w:ascii="Times New Roman" w:hAnsi="Times New Roman" w:cs="Times New Roman"/>
-          <w:sz w:val="28"/>
-        </w:rPr>
-        <w:t>API — програмний інтерфейс застосунку; REST — representational state transfer; CLI — інтерфейс командного рядка.</w:t>
+        <w:t>XGBoost — бібліотека градієнтного бустингу дерев рішень.</w:t>
       </w:r>
     </w:p>
     <w:p>
@@ -985,8 +1029,14 @@
       <w:r>
         <w:rPr>
           <w:rFonts w:ascii="Times New Roman" w:hAnsi="Times New Roman" w:cs="Times New Roman"/>
-          <w:b w:val="0"/>
-          <w:i w:val="0"/>
+          <w:b/>
+          <w:sz w:val="28"/>
+        </w:rPr>
+        <w:t xml:space="preserve">Оцінка сучасного стану об’єкта розроблення. </w:t>
+      </w:r>
+      <w:r>
+        <w:rPr>
+          <w:rFonts w:ascii="Times New Roman" w:hAnsi="Times New Roman" w:cs="Times New Roman"/>
           <w:sz w:val="28"/>
         </w:rPr>
         <w:t>Серцево-судинні захворювання залишаються провідною причиною смертності у світі, і значна їх частина пов’язана з порушеннями серцевого ритму. Електрокардіографія є найдоступнішим і найпоширенішим методом первинної діагностики таких порушень: вона неінвазивна, дешева й дає змогу безперервно спостерігати за електричною активністю серця. Сучасні носимі та холтерівські реєстратори формують записи тривалістю від кількох годин до кількох діб, і ручний перегляд таких обсягів лікарем стає неможливим. Звідси практична потреба в системах автоматичного аналізу, які здатні виділити окремі серцеві скорочення й віднести кожне з них до відповідного діагностичного класу.</w:t>
@@ -1017,11 +1067,17 @@
       <w:r>
         <w:rPr>
           <w:rFonts w:ascii="Times New Roman" w:hAnsi="Times New Roman" w:cs="Times New Roman"/>
-          <w:b w:val="0"/>
-          <w:i w:val="0"/>
+          <w:b/>
           <w:sz w:val="28"/>
         </w:rPr>
-        <w:t>Ця робота продовжує курсову роботу автора «Аналіз та класифікація відхилень та аномалій на ЕКГ», у якій було створено уніфікований парсер форматів, ансамблевий детектор R-піків, модулі морфологічного аналізу та аналізу варіабельності серцевого ритму, а також класифікацію аритмій на основі правил. Попередня система не використовувала машинного навчання, тому її точність на складних випадках була обмеженою. Завданням кваліфікаційної роботи є заміна класифікації на основі правил повноцінним конвеєром машинного навчання за збереження й повторного використання вже наявних перевірених компонентів обробки сигналу.</w:t>
+        <w:t xml:space="preserve">Актуальність роботи та підстави для її виконання. </w:t>
+      </w:r>
+      <w:r>
+        <w:rPr>
+          <w:rFonts w:ascii="Times New Roman" w:hAnsi="Times New Roman" w:cs="Times New Roman"/>
+          <w:sz w:val="28"/>
+        </w:rPr>
+        <w:t>Актуальність зумовлена поєднанням двох потреб: підвищення якості автоматичної класифікації серцевих скорочень сучасними методами навчання й забезпечення сумісності системи з різними форматами медичних даних без втрати цієї якості. Жодна з цих потреб окремо не є новою, проте їх спільне розв’язання в межах однієї відтворюваної системи трапляється рідко, що й визначає підстави для виконання роботи.</w:t>
       </w:r>
     </w:p>
     <w:p>
@@ -1033,24 +1089,14 @@
       <w:r>
         <w:rPr>
           <w:rFonts w:ascii="Times New Roman" w:hAnsi="Times New Roman" w:cs="Times New Roman"/>
-          <w:b w:val="0"/>
-          <w:i w:val="0"/>
+          <w:b/>
           <w:sz w:val="28"/>
         </w:rPr>
-        <w:t>Актуальність роботи зумовлена поєднанням двох потреб: підвищення якості автоматичної класифікації серцевих скорочень сучасними методами навчання й забезпечення сумісності системи з різними форматами медичних даних без втрати цієї якості. Жодна з цих потреб окремо не є новою, проте їх спільне розв’язання в межах однієї відтворюваної системи трапляється рідко.</w:t>
+        <w:t xml:space="preserve">Мета й завдання роботи. </w:t>
       </w:r>
-    </w:p>
-    <w:p>
-      <w:pPr>
-        <w:spacing w:line="360" w:lineRule="auto" w:after="0"/>
-        <w:ind w:firstLine="720"/>
-        <w:jc w:val="both"/>
-      </w:pPr>
       <w:r>
         <w:rPr>
           <w:rFonts w:ascii="Times New Roman" w:hAnsi="Times New Roman" w:cs="Times New Roman"/>
-          <w:b w:val="0"/>
-          <w:i w:val="0"/>
           <w:sz w:val="28"/>
         </w:rPr>
         <w:t>Метою роботи є розроблення уніфікованої системи обробки та класифікації ЕКГ-сигналів різних форматів із застосуванням методів машинного навчання. Для досягнення мети поставлено такі завдання.</w:t>
@@ -1177,11 +1223,17 @@
       <w:r>
         <w:rPr>
           <w:rFonts w:ascii="Times New Roman" w:hAnsi="Times New Roman" w:cs="Times New Roman"/>
-          <w:b w:val="0"/>
-          <w:i w:val="0"/>
+          <w:b/>
           <w:sz w:val="28"/>
         </w:rPr>
-        <w:t>Об’єктом дослідження є електрокардіографічні сигнали та процес автоматичної класифікації серцевих скорочень. Предметом дослідження є методи та алгоритми уніфікованого зчитування ЕКГ різних форматів, виділення ознак ударів і їх класифікації методами машинного навчання.</w:t>
+        <w:t xml:space="preserve">Об’єкт, методи й засоби дослідження. </w:t>
+      </w:r>
+      <w:r>
+        <w:rPr>
+          <w:rFonts w:ascii="Times New Roman" w:hAnsi="Times New Roman" w:cs="Times New Roman"/>
+          <w:sz w:val="28"/>
+        </w:rPr>
+        <w:t>Об’єктом дослідження є електрокардіографічні сигнали та процес автоматичної класифікації серцевих скорочень. Предметом дослідження є методи та алгоритми уніфікованого зчитування ЕКГ різних форматів, виділення ознак ударів і їх класифікації методами машинного навчання. Методи дослідження охоплюють цифрову обробку сигналів (смугова фільтрація, виявлення R-піків, вейвлет-аналіз), статистичний аналіз, класичне та глибоке машинне навчання, ансамблеве навчання, а також методику оцінювання класифікаторів за стандартом AAMI на міжпацієнтному поділі даних. Засоби розроблення: мова Python з бібліотеками NumPy, SciPy, scikit-learn, XGBoost, PyTorch, PyWavelets, wfdb, pyedflib, pydicom та FastAPI.</w:t>
       </w:r>
     </w:p>
     <w:p>
@@ -1193,27 +1245,17 @@
       <w:r>
         <w:rPr>
           <w:rFonts w:ascii="Times New Roman" w:hAnsi="Times New Roman" w:cs="Times New Roman"/>
-          <w:b w:val="0"/>
-          <w:i w:val="0"/>
+          <w:b/>
           <w:sz w:val="28"/>
         </w:rPr>
-        <w:t>Методи дослідження охоплюють цифрову обробку сигналів (смугова фільтрація, виявлення R-піків, вейвлет-аналіз), статистичний аналіз, класичне та глибоке машинне навчання, ансамблеве навчання, а також методику оцінювання класифікаторів за стандартом AAMI на міжпацієнтному поділі даних.</w:t>
+        <w:t xml:space="preserve">Наукова новизна. </w:t>
       </w:r>
-    </w:p>
-    <w:p>
-      <w:pPr>
-        <w:spacing w:line="360" w:lineRule="auto" w:after="0"/>
-        <w:ind w:firstLine="720"/>
-        <w:jc w:val="both"/>
-      </w:pPr>
       <w:r>
         <w:rPr>
           <w:rFonts w:ascii="Times New Roman" w:hAnsi="Times New Roman" w:cs="Times New Roman"/>
-          <w:b w:val="0"/>
-          <w:i w:val="0"/>
           <w:sz w:val="28"/>
         </w:rPr>
-        <w:t>Наукова новизна роботи полягає в такому.</w:t>
+        <w:t>До основних нових результатів роботи належать такі.</w:t>
       </w:r>
     </w:p>
     <w:p>
@@ -1253,11 +1295,39 @@
       <w:r>
         <w:rPr>
           <w:rFonts w:ascii="Times New Roman" w:hAnsi="Times New Roman" w:cs="Times New Roman"/>
-          <w:b w:val="0"/>
-          <w:i w:val="0"/>
+          <w:b/>
           <w:sz w:val="28"/>
         </w:rPr>
-        <w:t>Практичне значення полягає у створенні готової до використання відтворюваної системи з відкритим інтерфейсом, яку можна застосовувати для скринінгу аритмій і як платформу для подальших досліджень. Усі результати відтворюються наявними у репозиторії сценаріями.</w:t>
+        <w:t xml:space="preserve">Можливі сфери застосування. </w:t>
+      </w:r>
+      <w:r>
+        <w:rPr>
+          <w:rFonts w:ascii="Times New Roman" w:hAnsi="Times New Roman" w:cs="Times New Roman"/>
+          <w:sz w:val="28"/>
+        </w:rPr>
+        <w:t>Систему можна застосовувати для скринінгу серцево-судинних захворювань, у телемедичних системах і як відтворювану платформу для подальших досліджень з автоматичного аналізу ЕКГ. Усі результати відтворюються наявними у репозиторії сценаріями.</w:t>
+      </w:r>
+    </w:p>
+    <w:p>
+      <w:pPr>
+        <w:spacing w:line="360" w:lineRule="auto" w:after="0"/>
+        <w:ind w:firstLine="720"/>
+        <w:jc w:val="both"/>
+      </w:pPr>
+      <w:r>
+        <w:rPr>
+          <w:rFonts w:ascii="Times New Roman" w:hAnsi="Times New Roman" w:cs="Times New Roman"/>
+          <w:b/>
+          <w:sz w:val="28"/>
+        </w:rPr>
+        <w:t xml:space="preserve">Взаємозв’язок з іншими роботами. </w:t>
+      </w:r>
+      <w:r>
+        <w:rPr>
+          <w:rFonts w:ascii="Times New Roman" w:hAnsi="Times New Roman" w:cs="Times New Roman"/>
+          <w:sz w:val="28"/>
+        </w:rPr>
+        <w:t>Робота продовжує курсову роботу автора «Аналіз та класифікація відхилень та аномалій на ЕКГ», у якій було створено уніфікований парсер форматів, ансамблевий детектор R-піків, модулі морфологічного аналізу та аналізу варіабельності серцевого ритму, а також класифікацію аритмій на основі правил. Попередня система не використовувала машинного навчання, тому її точність на складних випадках була обмеженою; ця робота замінює класифікацію на основі правил повноцінним конвеєром машинного навчання за збереження вже наявних перевірених компонентів обробки сигналу.</w:t>
       </w:r>
     </w:p>
     <w:p>
@@ -1379,7 +1449,7 @@
           <w:rFonts w:ascii="Times New Roman" w:hAnsi="Times New Roman" w:cs="Times New Roman"/>
           <w:sz w:val="28"/>
         </w:rPr>
-        <w:t>Рисунок 1.1 – Схематична будова одного циклу ЕКГ із зубцями P, Q, R, S, T та комплексом QRS</w:t>
+        <w:t>Рисунок 1.1 — Схематична будова одного циклу ЕКГ із зубцями P, Q, R, S, T та комплексом QRS</w:t>
       </w:r>
     </w:p>
     <w:p>
@@ -1411,7 +1481,7 @@
           <w:i w:val="0"/>
           <w:sz w:val="28"/>
         </w:rPr>
-        <w:t>Реєстрація виконується у кількох відведеннях, кожне з яких відповідає певній проєкції сумарного електричного вектора серця. Стандартна клінічна ЕКГ містить дванадцять відведень; натомість тривалий холтерівський моніторинг зазвичай обмежується одним або двома каналами. У базі MIT-BIH, що є основним матеріалом цієї роботи, доступні два канали: модифіковане відведення MLII та одне з грудних відведень (V1 або V5). Рекомендації щодо стандартизації та інтерпретації ЕКГ узагальнено у праці [11].</w:t>
+        <w:t>Реєстрація виконується у кількох відведеннях, кожне з яких відповідає певній проєкції сумарного електричного вектора серця. Стандартна клінічна ЕКГ містить дванадцять відведень; натомість тривалий холтерівський моніторинг зазвичай обмежується одним або двома каналами. У базі MIT-BIH, що є основним матеріалом цієї роботи, доступні два канали: модифіковане відведення MLII та одне з грудних відведень (V1 або V5). Рекомендації щодо стандартизації та інтерпретації ЕКГ узагальнено у праці [1].</w:t>
       </w:r>
     </w:p>
     <w:p>
@@ -1427,7 +1497,7 @@
           <w:i w:val="0"/>
           <w:sz w:val="28"/>
         </w:rPr>
-        <w:t>Завдання автоматичного аналізу поділяють на кілька послідовних етапів: придушення завад і дрейфу ізолінії, виявлення R-піків як опорних точок ритму, сегментацію окремих ударів, виділення ознак і власне класифікацію. Помилка на ранньому етапі поширюється далі, тому надійне виявлення R-піків є передумовою якісної класифікації. Класичний алгоритм Пана й Томпкінса [7] досі залишається базовим для цього етапу.</w:t>
+        <w:t>Завдання автоматичного аналізу поділяють на кілька послідовних етапів: придушення завад і дрейфу ізолінії, виявлення R-піків як опорних точок ритму, сегментацію окремих ударів, виділення ознак і власне класифікацію. Помилка на ранньому етапі поширюється далі, тому надійне виявлення R-піків є передумовою якісної класифікації. Класичний алгоритм Пана й Томпкінса [2] досі залишається базовим для цього етапу.</w:t>
       </w:r>
     </w:p>
     <w:p>
@@ -1474,7 +1544,7 @@
           <w:rFonts w:ascii="Times New Roman" w:hAnsi="Times New Roman" w:cs="Times New Roman"/>
           <w:sz w:val="28"/>
         </w:rPr>
-        <w:t>– WFDB — формат і бібліотека PhysioNet; запис складається з заголовка .hea, бінарного файлу відліків .dat та файлу анотацій. Саме у цьому форматі поширюється MIT-BIH [8, 9].</w:t>
+        <w:t>– WFDB — формат і бібліотека PhysioNet; запис складається з заголовка .hea, бінарного файлу відліків .dat та файлу анотацій. Саме у цьому форматі поширюється MIT-BIH [3; 4].</w:t>
       </w:r>
     </w:p>
     <w:p>
@@ -1488,7 +1558,7 @@
           <w:rFonts w:ascii="Times New Roman" w:hAnsi="Times New Roman" w:cs="Times New Roman"/>
           <w:sz w:val="28"/>
         </w:rPr>
-        <w:t>– DICOM (доповнення Waveform) зберігає сигнали як частину медичного об’єкта поряд із демографічними даними пацієнта [25].</w:t>
+        <w:t>– DICOM (доповнення Waveform) зберігає сигнали як частину медичного об’єкта поряд із демографічними даними пацієнта [5].</w:t>
       </w:r>
     </w:p>
     <w:p>
@@ -1516,7 +1586,7 @@
           <w:rFonts w:ascii="Times New Roman" w:hAnsi="Times New Roman" w:cs="Times New Roman"/>
           <w:sz w:val="28"/>
         </w:rPr>
-        <w:t>– HL7 aECG — текстове подання у форматі XML, призначене для обміну анотованими ЕКГ між інформаційними системами [26].</w:t>
+        <w:t>– HL7 aECG — текстове подання у форматі XML, призначене для обміну анотованими ЕКГ між інформаційними системами [6].</w:t>
       </w:r>
     </w:p>
     <w:p>
@@ -1530,7 +1600,7 @@
           <w:rFonts w:ascii="Times New Roman" w:hAnsi="Times New Roman" w:cs="Times New Roman"/>
           <w:sz w:val="28"/>
         </w:rPr>
-        <w:t>– SCP-ECG (EN 1064) — компактний бінарний галузевий стандарт для цифрової електрокардіографії [27].</w:t>
+        <w:t>– SCP-ECG (EN 1064) — компактний бінарний галузевий стандарт для цифрової електрокардіографії [7].</w:t>
       </w:r>
     </w:p>
     <w:p>
@@ -1593,14 +1663,14 @@
           <w:i w:val="0"/>
           <w:sz w:val="28"/>
         </w:rPr>
-        <w:t>База MIT-BIH розмічена шістнадцятьма типами скорочень. Безпосереднє розрізнення всіх типів є непрактичним через значну незбалансованість і клінічну близькість окремих типів. Тому стандарт ANSI/AAMI EC57 [10] групує всі типи у п’ять суперкласів: нормальні (N), надшлуночкові ектопічні (S), шлуночкові ектопічні (V), зливні (F) та невизначені або штучно стимульовані (Q). Саме цю п’ятикласову схему застосовують для коректного порівняння з літературою. Відповідність вихідних позначень MIT-BIH суперкласам AAMI, реалізовану в системі, наведено в таблиці 1.1.</w:t>
+        <w:t>База MIT-BIH розмічена шістнадцятьма типами скорочень. Безпосереднє розрізнення всіх типів є непрактичним через значну незбалансованість і клінічну близькість окремих типів. Тому стандарт ANSI/AAMI EC57 [8] групує всі типи у п’ять суперкласів: нормальні (N), надшлуночкові ектопічні (S), шлуночкові ектопічні (V), зливні (F) та невизначені або штучно стимульовані (Q). Саме цю п’ятикласову схему застосовують для коректного порівняння з літературою. Відповідність вихідних позначень MIT-BIH суперкласам AAMI, реалізовану в системі, наведено в таблиці 1.1.</w:t>
       </w:r>
     </w:p>
     <w:p>
       <w:pPr>
         <w:keepNext/>
         <w:spacing w:before="120"/>
-        <w:ind w:firstLine="0"/>
+        <w:ind w:firstLine="720"/>
         <w:jc w:val="left"/>
       </w:pPr>
       <w:r>
@@ -1608,7 +1678,7 @@
           <w:rFonts w:ascii="Times New Roman" w:hAnsi="Times New Roman" w:cs="Times New Roman"/>
           <w:sz w:val="28"/>
         </w:rPr>
-        <w:t>Таблиця 1.1 – Відповідність позначень MIT-BIH суперкласам AAMI</w:t>
+        <w:t>Таблиця 1.1 — Відповідність позначень MIT-BIH суперкласам AAMI</w:t>
       </w:r>
     </w:p>
     <w:tbl>
@@ -2065,7 +2135,7 @@
           <w:rFonts w:ascii="Times New Roman" w:hAnsi="Times New Roman" w:cs="Times New Roman"/>
           <w:sz w:val="28"/>
         </w:rPr>
-        <w:t>Рисунок 1.2 – Приклади ударів п’яти суперкласів AAMI, виділені з бази MIT-BIH</w:t>
+        <w:t>Рисунок 1.2 — Приклади ударів п’яти суперкласів AAMI, виділені з бази MIT-BIH</w:t>
       </w:r>
     </w:p>
     <w:p>
@@ -2130,7 +2200,7 @@
           <w:i w:val="0"/>
           <w:sz w:val="28"/>
         </w:rPr>
-        <w:t>Класичне машинне навчання спирається на ручні ознаки. Основоположна праця de Chazal та співавторів [1] поєднала морфологічні ознаки з ознаками інтервалів між ударами й лінійним класифікатором, запровадивши міжпацієнтний протокол оцінювання, який став стандартом де-факто. Llamedo та Martínez [2] показали роль відбору ознак за критерієм узагальнення між базами, а Mar та співавтори [3] поєднали вейвлет-ознаки з послідовним відбором та нейронною мережею. Спільним для цих праць є висновок, що надшлуночкові скорочення визначаються переважно ритмом (ознаками RR), а шлуночкові — формою.</w:t>
+        <w:t>Класичне машинне навчання спирається на ручні ознаки. Основоположна праця de Chazal та співавторів [9] поєднала морфологічні ознаки з ознаками інтервалів між ударами й лінійним класифікатором, запровадивши міжпацієнтний протокол оцінювання, який став стандартом де-факто. Llamedo та Martínez [10] показали роль відбору ознак за критерієм узагальнення між базами, а Mar та співавтори [11] поєднали вейвлет-ознаки з послідовним відбором та нейронною мережею. Спільним для цих праць є висновок, що надшлуночкові скорочення визначаються переважно ритмом (ознаками RR), а шлуночкові — формою.</w:t>
       </w:r>
     </w:p>
     <w:p>
@@ -2146,7 +2216,7 @@
           <w:i w:val="0"/>
           <w:sz w:val="28"/>
         </w:rPr>
-        <w:t>Глибоке навчання дає змогу відмовитися від ручного конструювання ознак. Acharya та співавтори [5] застосували одновимірну згорткову мережу до сегментів ЕКГ, Kachuee та співавтори [4] запропонували глибоке залишкове подання з перенесенням знань, а Hannun, Rajpurkar та співавтори [6] продемонстрували на великому наборі амбулаторних записів якість, що наближається до рівня лікаря-кардіолога. Загальні принципи глибокого навчання узагальнено в огляді [17].</w:t>
+        <w:t>Глибоке навчання дає змогу відмовитися від ручного конструювання ознак. Acharya та співавтори [12] застосували одновимірну згорткову мережу до сегментів ЕКГ, Kachuee та співавтори [13] запропонували глибоке залишкове подання з перенесенням знань, а Hannun, Rajpurkar та співавтори [14] продемонстрували на великому наборі амбулаторних записів якість, що наближається до рівня лікаря-кардіолога. Загальні принципи глибокого навчання узагальнено в огляді [15].</w:t>
       </w:r>
     </w:p>
     <w:p>
@@ -2179,7 +2249,7 @@
           <w:i w:val="0"/>
           <w:sz w:val="28"/>
         </w:rPr>
-        <w:t>Достовірність опублікованих показників критично залежить від способу поділу даних. За випадкового поділу удари того самого пацієнта потрапляють і в навчальну, і в тестову вибірку, що завищує оцінку через індивідуальні особливості ритму. Міжпацієнтний поділ DS1/DS2 [1] усуває це: записи пацієнтів навчальної та тестової підмножин не перетинаються. Через це абсолютні значення показників за міжпацієнтним протоколом помітно нижчі, ніж за внутрішньопацієнтним, але саме вони відображають реальну здатність моделі до узагальнення на нових пацієнтів, а не запам’ятовування індивідуального ритму.</w:t>
+        <w:t>Достовірність опублікованих показників критично залежить від способу поділу даних. За випадкового поділу удари того самого пацієнта потрапляють і в навчальну, і в тестову вибірку, що завищує оцінку через індивідуальні особливості ритму. Міжпацієнтний поділ DS1/DS2 [9] усуває це: записи пацієнтів навчальної та тестової підмножин не перетинаються. Через це абсолютні значення показників за міжпацієнтним протоколом помітно нижчі, ніж за внутрішньопацієнтним, але саме вони відображають реальну здатність моделі до узагальнення на нових пацієнтів, а не запам’ятовування індивідуального ритму.</w:t>
       </w:r>
     </w:p>
     <w:p>
@@ -2446,7 +2516,7 @@
           <w:rFonts w:ascii="Times New Roman" w:hAnsi="Times New Roman" w:cs="Times New Roman"/>
           <w:sz w:val="28"/>
         </w:rPr>
-        <w:t>Рисунок 2.1 – Загальна архітектура системи: від вхідних форматів через спільне подання до моделей і сервісів</w:t>
+        <w:t>Рисунок 2.1 — Загальна архітектура системи: від вхідних форматів через спільне подання до моделей і сервісів</w:t>
       </w:r>
     </w:p>
     <w:p>
@@ -2577,7 +2647,7 @@
           <w:i w:val="0"/>
           <w:sz w:val="28"/>
         </w:rPr>
-        <w:t>Опорними точками ритму є R-піки. У системі застосовано ансамблевий детектор, що поєднує три взаємодоповнювальні підходи. Перший — класичний алгоритм Пана й Томпкінса [7], який послідовно виконує смугову фільтрацію, диференціювання, піднесення до квадрата та інтегрування ковзним вікном. Диференціювання підкреслює круті фронти комплексу QRS:</w:t>
+        <w:t>Опорними точками ритму є R-піки. У системі застосовано ансамблевий детектор, що поєднує три взаємодоповнювальні підходи. Перший — класичний алгоритм Пана й Томпкінса [2], який послідовно виконує смугову фільтрацію, диференціювання, піднесення до квадрата та інтегрування ковзним вікном. Диференціювання підкреслює круті фронти комплексу QRS:</w:t>
       </w:r>
     </w:p>
     <w:p>
@@ -2625,7 +2695,7 @@
           <w:i w:val="0"/>
           <w:sz w:val="28"/>
         </w:rPr>
-        <w:t>Другий підхід — самостійне адаптивне порогування вихідного сигналу, що підлаштовується під локальну амплітуду й компенсує дрейф ізолінії. Третій — вейвлет-аналіз [13], який локалізує різкі перепади комплексу QRS у часо-частотній площині й стійкий до вузькосмугових завад. Узгодження рішень трьох гілок підвищує надійність виявлення на зашумлених ділянках порівняно з кожним методом окремо. Точність цього етапу безпосередньо впливає на якість сегментації ударів і виділених з них ознак, тому йому приділено особливу увагу.</w:t>
+        <w:t>Другий підхід — самостійне адаптивне порогування вихідного сигналу, що підлаштовується під локальну амплітуду й компенсує дрейф ізолінії. Третій — вейвлет-аналіз [16], який локалізує різкі перепади комплексу QRS у часо-частотній площині й стійкий до вузькосмугових завад. Узгодження рішень трьох гілок підвищує надійність виявлення на зашумлених ділянках порівняно з кожним методом окремо. Точність цього етапу безпосередньо впливає на якість сегментації ударів і виділених з них ознак, тому йому приділено особливу увагу.</w:t>
       </w:r>
     </w:p>
     <w:p>
@@ -2691,7 +2761,7 @@
           <w:i w:val="0"/>
           <w:sz w:val="28"/>
         </w:rPr>
-        <w:t>Послідовність інтервалів RR несе інформацію про регуляцію серцевого ритму. Модуль аналізу варіабельності обчислює показники в часовій, частотній і нелінійній областях відповідно до рекомендацій [12]. Для задачі класифікації окремого удару найважливішими є локальні ознаки ритму: попередній і наступний інтервали RR та їх співвідношення, які дають змогу відрізнити передчасні надшлуночкові скорочення від нормальних.</w:t>
+        <w:t>Послідовність інтервалів RR несе інформацію про регуляцію серцевого ритму. Модуль аналізу варіабельності обчислює показники в часовій, частотній і нелінійній областях відповідно до рекомендацій [17]. Для задачі класифікації окремого удару найважливішими є локальні ознаки ритму: попередній і наступний інтервали RR та їх співвідношення, які дають змогу відрізнити передчасні надшлуночкові скорочення від нормальних.</w:t>
       </w:r>
     </w:p>
     <w:p>
@@ -2812,7 +2882,7 @@
           <w:rFonts w:ascii="Times New Roman" w:hAnsi="Times New Roman" w:cs="Times New Roman"/>
           <w:sz w:val="28"/>
         </w:rPr>
-        <w:t>Рисунок 2.2 – Сегментація удару: вікно у 260 відліків (90 до R-піка та 170 після) навколо опорної точки</w:t>
+        <w:t>Рисунок 2.2 — Сегментація удару: вікно у 260 відліків (90 до R-піка та 170 після) навколо опорної точки</w:t>
       </w:r>
     </w:p>
     <w:p>
@@ -2878,14 +2948,14 @@
           <w:i w:val="0"/>
           <w:sz w:val="28"/>
         </w:rPr>
-        <w:t>Експерименти виконано на MIT-BIH Arrhythmia Database [8, 9] — загальновизнаній базі з 48 півгодинних записів, оцифрованих з частотою 360 Гц. Завантаження виконується безпосередньо з PhysioNet, після чого кожне анотоване скорочення зіставляється з суперкласом AAMI. Чотири записи зі штучною стимуляцією (102, 104, 107, 217) вилучено згідно зі стандартом EC57 [10]. Решту розподілено за міжпацієнтним поділом de Chazal [1] на навчальну підмножину DS1 та тестову DS2 по 22 записи в кожній. Склад підмножин наведено в таблиці 3.1.</w:t>
+        <w:t>Експерименти виконано на MIT-BIH Arrhythmia Database [3; 4] — загальновизнаній базі з 48 півгодинних записів, оцифрованих з частотою 360 Гц. Завантаження виконується безпосередньо з PhysioNet, після чого кожне анотоване скорочення зіставляється з суперкласом AAMI. Чотири записи зі штучною стимуляцією (102, 104, 107, 217) вилучено згідно зі стандартом EC57 [8]. Решту розподілено за міжпацієнтним поділом de Chazal [9] на навчальну підмножину DS1 та тестову DS2 по 22 записи в кожній. Склад підмножин наведено в таблиці 3.1.</w:t>
       </w:r>
     </w:p>
     <w:p>
       <w:pPr>
         <w:keepNext/>
         <w:spacing w:before="120"/>
-        <w:ind w:firstLine="0"/>
+        <w:ind w:firstLine="720"/>
         <w:jc w:val="left"/>
       </w:pPr>
       <w:r>
@@ -2893,7 +2963,7 @@
           <w:rFonts w:ascii="Times New Roman" w:hAnsi="Times New Roman" w:cs="Times New Roman"/>
           <w:sz w:val="28"/>
         </w:rPr>
-        <w:t>Таблиця 3.1 – Міжпацієнтний поділ записів MIT-BIH</w:t>
+        <w:t>Таблиця 3.1 — Міжпацієнтний поділ записів MIT-BIH</w:t>
       </w:r>
     </w:p>
     <w:tbl>
@@ -3129,7 +3199,7 @@
       <w:pPr>
         <w:keepNext/>
         <w:spacing w:before="120"/>
-        <w:ind w:firstLine="0"/>
+        <w:ind w:firstLine="720"/>
         <w:jc w:val="left"/>
       </w:pPr>
       <w:r>
@@ -3137,7 +3207,7 @@
           <w:rFonts w:ascii="Times New Roman" w:hAnsi="Times New Roman" w:cs="Times New Roman"/>
           <w:sz w:val="28"/>
         </w:rPr>
-        <w:t>Таблиця 3.2 – Групи ознак окремого удару (для одного відведення)</w:t>
+        <w:t>Таблиця 3.2 — Групи ознак окремого удару (для одного відведення)</w:t>
       </w:r>
     </w:p>
     <w:tbl>
@@ -3476,7 +3546,7 @@
           <w:i w:val="0"/>
           <w:sz w:val="28"/>
         </w:rPr>
-        <w:t>Вейвлет-ознаки обчислюються дискретним вейвлет-перетворенням з базисом Добеші db4 [13]; такий базис добре узгоджується з формою комплексу QRS. Ознаки RR відображають ритмічний контекст удару, а морфологічні та статистичні — його форму.</w:t>
+        <w:t>Вейвлет-ознаки обчислюються дискретним вейвлет-перетворенням з базисом Добеші db4 [16]; такий базис добре узгоджується з формою комплексу QRS. Ознаки RR відображають ритмічний контекст удару, а морфологічні та статистичні — його форму.</w:t>
       </w:r>
     </w:p>
     <w:p>
@@ -3509,7 +3579,7 @@
           <w:i w:val="0"/>
           <w:sz w:val="28"/>
         </w:rPr>
-        <w:t>Реалізовано три класичні моделі зі спільним інтерфейсом на основі бібліотеки scikit-learn [21] (метод опорних векторів і випадковий ліс) та XGBoost. Випадковий ліс [15] будує ансамбль із 400 вирішальних дерев на бутстрап-вибірках із випадковим підмножиною ознак у кожному вузлі; підсумкове рішення ухвалюють голосуванням дерев, що знижує дисперсію й робить модель стійкою до шуму в ознаках.</w:t>
+        <w:t>Реалізовано три класичні моделі зі спільним інтерфейсом на основі бібліотеки scikit-learn [18] (метод опорних векторів і випадковий ліс) та XGBoost. Випадковий ліс [19] будує ансамбль із 400 вирішальних дерев на бутстрап-вибірках із випадковим підмножиною ознак у кожному вузлі; підсумкове рішення ухвалюють голосуванням дерев, що знижує дисперсію й робить модель стійкою до шуму в ознаках.</w:t>
       </w:r>
     </w:p>
     <w:p>
@@ -3525,7 +3595,7 @@
           <w:i w:val="0"/>
           <w:sz w:val="28"/>
         </w:rPr>
-        <w:t>Градієнтний бустинг XGBoost [14] будує ансамбль дерев послідовно: кожне нове дерево наближає від’ємний градієнт функції втрат попереднього наближення. Модель мінімізує регуляризований функціонал</w:t>
+        <w:t>Градієнтний бустинг XGBoost [20] будує ансамбль дерев послідовно: кожне нове дерево наближає від’ємний градієнт функції втрат попереднього наближення. Модель мінімізує регуляризований функціонал</w:t>
       </w:r>
     </w:p>
     <w:p>
@@ -3573,7 +3643,7 @@
           <w:i w:val="0"/>
           <w:sz w:val="28"/>
         </w:rPr>
-        <w:t>Метод опорних векторів [16] будує гіперплощину з максимальним зазором у просторі, нелінійно перетвореному ядровою функцією. Застосовано радіальне (гаусове) ядро</w:t>
+        <w:t>Метод опорних векторів [21] будує гіперплощину з максимальним зазором у просторі, нелінійно перетвореному ядровою функцією. Застосовано радіальне (гаусове) ядро</w:t>
       </w:r>
     </w:p>
     <w:p>
@@ -3654,7 +3724,7 @@
           <w:i w:val="0"/>
           <w:sz w:val="28"/>
         </w:rPr>
-        <w:t>Згорткова мережа працює безпосередньо з нормалізованим вікном удару й самостійно навчається ознак. Архітектура складається з чотирьох згорткових блоків зі зростаючою кількістю фільтрів (16, 32, 64, 128); кожний блок містить одновимірну згортку, пакетну нормалізацію [19], активацію ReLU та зменшення розмірності. Після блоків застосовано глобальне середнє агрегування й повнозв’язні шари з функцією softmax на п’ять класів. Згорткові й рекурентні моделі реалізовано засобами бібліотеки PyTorch [22], а обчислення над масивами та цифрову обробку сигналу виконано засобами NumPy [23] і SciPy [24]. Структуру мережі показано на рисунку 3.1.</w:t>
+        <w:t>Згорткова мережа працює безпосередньо з нормалізованим вікном удару й самостійно навчається ознак. Архітектура складається з чотирьох згорткових блоків зі зростаючою кількістю фільтрів (16, 32, 64, 128); кожний блок містить одновимірну згортку, пакетну нормалізацію [22], активацію ReLU та зменшення розмірності. Після блоків застосовано глобальне середнє агрегування й повнозв’язні шари з функцією softmax на п’ять класів. Згорткові й рекурентні моделі реалізовано засобами бібліотеки PyTorch [23], а обчислення над масивами та цифрову обробку сигналу виконано засобами NumPy [24] і SciPy [25]. Структуру мережі показано на рисунку 3.1.</w:t>
       </w:r>
     </w:p>
     <w:p>
@@ -3710,7 +3780,7 @@
           <w:rFonts w:ascii="Times New Roman" w:hAnsi="Times New Roman" w:cs="Times New Roman"/>
           <w:sz w:val="28"/>
         </w:rPr>
-        <w:t>Рисунок 3.1 – Архітектура одновимірної згорткової мережі для класифікації удару</w:t>
+        <w:t>Рисунок 3.1 — Архітектура одновимірної згорткової мережі для класифікації удару</w:t>
       </w:r>
     </w:p>
     <w:p>
@@ -3823,7 +3893,7 @@
           <w:i w:val="0"/>
           <w:sz w:val="28"/>
         </w:rPr>
-        <w:t>Для врахування часового контексту реалізовано модель CNN-BiLSTM, у якій згорткові блоки виділяють локальні ознаки, а двонапрямлений шар довгої короткочасної пам’яті [18] моделює послідовну залежність уздовж сигналу. Така архітектура поширена в задачах аналізу часових рядів, проте за обмеженого навчання на процесорі вона виявилася чутливою до недонавчання.</w:t>
+        <w:t>Для врахування часового контексту реалізовано модель CNN-BiLSTM, у якій згорткові блоки виділяють локальні ознаки, а двонапрямлений шар довгої короткочасної пам’яті [26] моделює послідовну залежність уздовж сигналу. Така архітектура поширена в задачах аналізу часових рядів, проте за обмеженого навчання на процесорі вона виявилася чутливою до недонавчання.</w:t>
       </w:r>
     </w:p>
     <w:p>
@@ -3912,7 +3982,7 @@
           <w:rFonts w:ascii="Times New Roman" w:hAnsi="Times New Roman" w:cs="Times New Roman"/>
           <w:sz w:val="28"/>
         </w:rPr>
-        <w:t>Рисунок 3.2 – Двопотоковий гібридний класифікатор із пізнім злиттям імовірнісних виходів двох базових моделей</w:t>
+        <w:t>Рисунок 3.2 — Двопотоковий гібридний класифікатор із пізнім злиттям імовірнісних виходів двох базових моделей</w:t>
       </w:r>
     </w:p>
     <w:p>
@@ -3928,7 +3998,7 @@
           <w:i w:val="0"/>
           <w:sz w:val="28"/>
         </w:rPr>
-        <w:t>Перший потік — навчений XGBoost над 35- чи 70-вимірним вектором ручних ознак; другий — згорткова мережа над сирим вікном удару. Кожний потік повертає вектор імовірностей п’яти класів, p_x та p_c відповідно. Їх об’єднують у спільний десятивимірний опис z = [p_x; p_c] (вектор завдовжки 10), на якому навчають невеликий мета-класифікатор — логістичну регресію, що передбачає клас за argmax softmax(W·z + b). Щоб уникнути перенавчання мета-класифікатора, його ознаки формують за схемою стекового узагальнення [20]: навчальну вибірку розбивають на п’ять згорток, базові моделі навчають на чотирьох згортках і застосовують до п’ятої, а отримані поза навчанням імовірності використовують для навчання мета-класифікатора. Остаточно базові моделі перенавчають на всій навчальній вибірці.</w:t>
+        <w:t>Перший потік — навчений XGBoost над 35- чи 70-вимірним вектором ручних ознак; другий — згорткова мережа над сирим вікном удару. Кожний потік повертає вектор імовірностей п’яти класів, p_x та p_c відповідно. Їх об’єднують у спільний десятивимірний опис z = [p_x; p_c] (вектор завдовжки 10), на якому навчають невеликий мета-класифікатор — логістичну регресію, що передбачає клас за argmax softmax(W·z + b). Щоб уникнути перенавчання мета-класифікатора, його ознаки формують за схемою стекового узагальнення [27]: навчальну вибірку розбивають на п’ять згорток, базові моделі навчають на чотирьох згортках і застосовують до п’ятої, а отримані поза навчанням імовірності використовують для навчання мета-класифікатора. Остаточно базові моделі перенавчають на всій навчальній вибірці.</w:t>
       </w:r>
     </w:p>
     <w:p>
@@ -4060,14 +4130,14 @@
           <w:i w:val="0"/>
           <w:sz w:val="28"/>
         </w:rPr>
-        <w:t>Зведені показники одновідвідних моделей наведено в таблиці 4.1. Базова лінія на основі правил очікувано слабка: вона зовсім не виявляє шлуночкових і зливних скорочень (F1 = 0). Найвищу загальну точність (0,929) показує випадковий ліс, проте його macro-F1 лише 0,374, бо він майже завжди передбачає клас N. Найкращий збалансований показник серед одновідвідних моделей належить методу опорних векторів (macro-F1 = 0,461).</w:t>
+        <w:t>Зведені показники одновідвідних моделей наведено в таблиці 4.1. Базова лінія на основі правил очікувано слабка: вона зовсім не виявляє шлуночкових і зливних скорочень (F1 = 0). Найвищу загальну точність (0,929) показує випадковий ліс, проте його macro-F1 лише 0,374, бо він майже завжди передбачає клас N. Найкращий збалансований показник серед одновідвідних моделей належить методу опорних векторів (macro-F1 0,461).</w:t>
       </w:r>
     </w:p>
     <w:p>
       <w:pPr>
         <w:keepNext/>
         <w:spacing w:before="120"/>
-        <w:ind w:firstLine="0"/>
+        <w:ind w:firstLine="720"/>
         <w:jc w:val="left"/>
       </w:pPr>
       <w:r>
@@ -4075,7 +4145,7 @@
           <w:rFonts w:ascii="Times New Roman" w:hAnsi="Times New Roman" w:cs="Times New Roman"/>
           <w:sz w:val="28"/>
         </w:rPr>
-        <w:t>Таблиця 4.1 – Показники моделей на одному відведенні (MLII), тестова підмножина DS2</w:t>
+        <w:t>Таблиця 4.1 — Показники моделей на одному відведенні (MLII), тестова підмножина DS2</w:t>
       </w:r>
     </w:p>
     <w:tbl>
@@ -5300,7 +5370,7 @@
           <w:rFonts w:ascii="Times New Roman" w:hAnsi="Times New Roman" w:cs="Times New Roman"/>
           <w:sz w:val="28"/>
         </w:rPr>
-        <w:t>Рисунок 4.1 – Матриця невідповідностей базової лінії на основі правил</w:t>
+        <w:t>Рисунок 4.1 — Матриця невідповідностей базової лінії на основі правил</w:t>
       </w:r>
     </w:p>
     <w:p>
@@ -5356,7 +5426,7 @@
           <w:rFonts w:ascii="Times New Roman" w:hAnsi="Times New Roman" w:cs="Times New Roman"/>
           <w:sz w:val="28"/>
         </w:rPr>
-        <w:t>Рисунок 4.2 – Матриця невідповідностей моделі XGBoost на одному відведенні</w:t>
+        <w:t>Рисунок 4.2 — Матриця невідповідностей моделі XGBoost на одному відведенні</w:t>
       </w:r>
     </w:p>
     <w:p>
@@ -5388,7 +5458,7 @@
           <w:i w:val="0"/>
           <w:sz w:val="28"/>
         </w:rPr>
-        <w:t>Недостатня якість глибоких моделей пояснюється сукупністю причин: навчання обмеженою кількістю епох на процесорі, використання лише одного відведення та відсутність аугментації даних. Подібні значення для коротко навчених одновідвідних мереж узгоджуються з літературою [4]; за повноцінного навчання на графічному прискорювачі очікуваний приріст macro-F1 згорткових моделей становить 5–10 відсоткових пунктів, тоді як класичні моделі вже збігаються за кілька секунд навчання й приросту не дадуть.</w:t>
+        <w:t>Недостатня якість глибоких моделей пояснюється сукупністю причин: навчання обмеженою кількістю епох на процесорі, використання лише одного відведення та відсутність аугментації даних. Подібні значення для коротко навчених одновідвідних мереж узгоджуються з літературою [13]; за повноцінного навчання на графічному прискорювачі очікуваний приріст macro-F1 згорткових моделей становить 5–10 відсоткових пунктів, тоді як класичні моделі вже збігаються за кілька секунд навчання й приросту не дадуть.</w:t>
       </w:r>
     </w:p>
     <w:p>
@@ -5428,7 +5498,7 @@
       <w:pPr>
         <w:keepNext/>
         <w:spacing w:before="120"/>
-        <w:ind w:firstLine="0"/>
+        <w:ind w:firstLine="720"/>
         <w:jc w:val="left"/>
       </w:pPr>
       <w:r>
@@ -5436,7 +5506,7 @@
           <w:rFonts w:ascii="Times New Roman" w:hAnsi="Times New Roman" w:cs="Times New Roman"/>
           <w:sz w:val="28"/>
         </w:rPr>
-        <w:t>Таблиця 4.2 – Повнота за рідкісними класами на одному відведенні (DS2)</w:t>
+        <w:t>Таблиця 4.2 — Повнота за рідкісними класами на одному відведенні (DS2)</w:t>
       </w:r>
     </w:p>
     <w:tbl>
@@ -6162,7 +6232,7 @@
           <w:rFonts w:ascii="Times New Roman" w:hAnsi="Times New Roman" w:cs="Times New Roman"/>
           <w:sz w:val="28"/>
         </w:rPr>
-        <w:t>Рисунок 4.3 – Міра F1 за класами для всіх моделей</w:t>
+        <w:t>Рисунок 4.3 — Міра F1 за класами для всіх моделей</w:t>
       </w:r>
     </w:p>
     <w:p>
@@ -6218,7 +6288,7 @@
           <w:rFonts w:ascii="Times New Roman" w:hAnsi="Times New Roman" w:cs="Times New Roman"/>
           <w:sz w:val="28"/>
         </w:rPr>
-        <w:t>Рисунок 4.4 – Повнота за рідкісними класами S, V, F</w:t>
+        <w:t>Рисунок 4.4 — Повнота за рідкісними класами S, V, F</w:t>
       </w:r>
     </w:p>
     <w:p>
@@ -6251,14 +6321,14 @@
           <w:i w:val="0"/>
           <w:sz w:val="28"/>
         </w:rPr>
-        <w:t>Додавання другого відведення дає найбільший приріст саме за рідкісними класами (таблиця 4.3). Метод опорних векторів на двох відведеннях досягає найкращого в роботі macro-F1 = 0,466 і найвищої повноти за класом S (0,581), а гібрид на двох відведеннях — найвищої повноти за зливними скороченнями (0,892). Матриці невідповідностей цих двох моделей показано на рисунках 4.5 і 4.6.</w:t>
+        <w:t>Додавання другого відведення дає найбільший приріст саме за рідкісними класами (таблиця 4.3). Метод опорних векторів на двох відведеннях досягає найкращого в роботі macro-F1 0,466 і найвищої повноти за класом S (0,581), а гібрид на двох відведеннях — найвищої повноти за зливними скороченнями (0,892). Матриці невідповідностей цих двох моделей показано на рисунках 4.5 і 4.6.</w:t>
       </w:r>
     </w:p>
     <w:p>
       <w:pPr>
         <w:keepNext/>
         <w:spacing w:before="120"/>
-        <w:ind w:firstLine="0"/>
+        <w:ind w:firstLine="720"/>
         <w:jc w:val="left"/>
       </w:pPr>
       <w:r>
@@ -6266,7 +6336,7 @@
           <w:rFonts w:ascii="Times New Roman" w:hAnsi="Times New Roman" w:cs="Times New Roman"/>
           <w:sz w:val="28"/>
         </w:rPr>
-        <w:t>Таблиця 4.3 – Показники моделей на двох відведеннях (MLII + V1/V5), DS2</w:t>
+        <w:t>Таблиця 4.3 — Показники моделей на двох відведеннях (MLII + V1/V5), DS2</w:t>
       </w:r>
     </w:p>
     <w:tbl>
@@ -6948,7 +7018,7 @@
           <w:rFonts w:ascii="Times New Roman" w:hAnsi="Times New Roman" w:cs="Times New Roman"/>
           <w:sz w:val="28"/>
         </w:rPr>
-        <w:t>Рисунок 4.5 – Матриця невідповідностей методу опорних векторів на двох відведеннях</w:t>
+        <w:t>Рисунок 4.5 — Матриця невідповідностей методу опорних векторів на двох відведеннях</w:t>
       </w:r>
     </w:p>
     <w:p>
@@ -7004,7 +7074,7 @@
           <w:rFonts w:ascii="Times New Roman" w:hAnsi="Times New Roman" w:cs="Times New Roman"/>
           <w:sz w:val="28"/>
         </w:rPr>
-        <w:t>Рисунок 4.6 – Матриця невідповідностей гібридного класифікатора на двох відведеннях</w:t>
+        <w:t>Рисунок 4.6 — Матриця невідповідностей гібридного класифікатора на двох відведеннях</w:t>
       </w:r>
     </w:p>
     <w:p>
@@ -7109,7 +7179,7 @@
           <w:rFonts w:ascii="Times New Roman" w:hAnsi="Times New Roman" w:cs="Times New Roman"/>
           <w:sz w:val="28"/>
         </w:rPr>
-        <w:t>Рисунок 4.7 – ROC-криві за схемою «один проти всіх»</w:t>
+        <w:t>Рисунок 4.7 — ROC-криві за схемою «один проти всіх»</w:t>
       </w:r>
     </w:p>
     <w:p>
@@ -7198,7 +7268,7 @@
           <w:rFonts w:ascii="Times New Roman" w:hAnsi="Times New Roman" w:cs="Times New Roman"/>
           <w:sz w:val="28"/>
         </w:rPr>
-        <w:t>Рисунок 4.8 – Важливість ознак моделі XGBoost</w:t>
+        <w:t>Рисунок 4.8 — Важливість ознак моделі XGBoost</w:t>
       </w:r>
     </w:p>
     <w:p>
@@ -7238,7 +7308,7 @@
       <w:pPr>
         <w:keepNext/>
         <w:spacing w:before="120"/>
-        <w:ind w:firstLine="0"/>
+        <w:ind w:firstLine="720"/>
         <w:jc w:val="left"/>
       </w:pPr>
       <w:r>
@@ -7246,7 +7316,7 @@
           <w:rFonts w:ascii="Times New Roman" w:hAnsi="Times New Roman" w:cs="Times New Roman"/>
           <w:sz w:val="28"/>
         </w:rPr>
-        <w:t>Таблиця 4.4 – Стійкість класифікації до перетворення форматів (повна DS2)</w:t>
+        <w:t>Таблиця 4.4 — Стійкість класифікації до перетворення форматів (повна DS2)</w:t>
       </w:r>
     </w:p>
     <w:tbl>
@@ -8353,7 +8423,7 @@
           <w:rFonts w:ascii="Times New Roman" w:hAnsi="Times New Roman" w:cs="Times New Roman"/>
           <w:sz w:val="28"/>
         </w:rPr>
-        <w:t>Рисунок 4.9 – Узгодженість міток і точність після перетворення між форматами</w:t>
+        <w:t>Рисунок 4.9 — Узгодженість міток і точність після перетворення між форматами</w:t>
       </w:r>
     </w:p>
     <w:p>
@@ -8409,7 +8479,7 @@
           <w:rFonts w:ascii="Times New Roman" w:hAnsi="Times New Roman" w:cs="Times New Roman"/>
           <w:sz w:val="28"/>
         </w:rPr>
-        <w:t>Рисунок 4.10 – Порівняння форми сигналу до й після перетворення через спільне подання</w:t>
+        <w:t>Рисунок 4.10 — Порівняння форми сигналу до й після перетворення через спільне подання</w:t>
       </w:r>
     </w:p>
     <w:p>
@@ -8465,7 +8535,7 @@
       <w:pPr>
         <w:keepNext/>
         <w:spacing w:before="120"/>
-        <w:ind w:firstLine="0"/>
+        <w:ind w:firstLine="720"/>
         <w:jc w:val="left"/>
       </w:pPr>
       <w:r>
@@ -8473,7 +8543,7 @@
           <w:rFonts w:ascii="Times New Roman" w:hAnsi="Times New Roman" w:cs="Times New Roman"/>
           <w:sz w:val="28"/>
         </w:rPr>
-        <w:t>Таблиця 4.5 – Порівняння з літературою (міжпацієнтний протокол AAMI, DS1/DS2)</w:t>
+        <w:t>Таблиця 4.5 — Порівняння з літературою (міжпацієнтний протокол AAMI, DS1/DS2)</w:t>
       </w:r>
     </w:p>
     <w:tbl>
@@ -8567,7 +8637,7 @@
                 <w:b w:val="0"/>
                 <w:sz w:val="22"/>
               </w:rPr>
-              <w:t>de Chazal та ін. [1]</w:t>
+              <w:t>de Chazal та ін. [9]</w:t>
             </w:r>
           </w:p>
         </w:tc>
@@ -8629,7 +8699,7 @@
                 <w:b w:val="0"/>
                 <w:sz w:val="22"/>
               </w:rPr>
-              <w:t>Llamedo, Martínez [2]</w:t>
+              <w:t>Llamedo, Martínez [10]</w:t>
             </w:r>
           </w:p>
         </w:tc>
@@ -8691,7 +8761,7 @@
                 <w:b w:val="0"/>
                 <w:sz w:val="22"/>
               </w:rPr>
-              <w:t>Mar та ін. [3]</w:t>
+              <w:t>Mar та ін. [11]</w:t>
             </w:r>
           </w:p>
         </w:tc>
@@ -8753,7 +8823,7 @@
                 <w:b w:val="0"/>
                 <w:sz w:val="22"/>
               </w:rPr>
-              <w:t>Kachuee та ін. [4]</w:t>
+              <w:t>Kachuee та ін. [13]</w:t>
             </w:r>
           </w:p>
         </w:tc>
@@ -9153,7 +9223,7 @@
           <w:rFonts w:ascii="Times New Roman" w:hAnsi="Times New Roman" w:cs="Times New Roman"/>
           <w:sz w:val="28"/>
         </w:rPr>
-        <w:t>– Навчено й порівняно сім моделей; найкращий збалансований показник macro-F1 = 0,466 досягнуто методом опорних векторів на двох відведеннях, що відповідає рівню опублікованих результатів для цього протоколу.</w:t>
+        <w:t>– Навчено й порівняно сім моделей; найкращий збалансований показник macro-F1 0,466 досягнуто методом опорних векторів на двох відведеннях, що відповідає рівню опублікованих результатів для цього протоколу.</w:t>
       </w:r>
     </w:p>
     <w:p>
@@ -9243,6 +9313,126 @@
           <w:rFonts w:ascii="Times New Roman" w:hAnsi="Times New Roman" w:cs="Times New Roman"/>
           <w:sz w:val="28"/>
         </w:rPr>
+        <w:t>Kligfield P., Gettes L. S., Bailey J. J. та ін. Recommendations for the standardization and interpretation of the electrocardiogram. Circulation. 2007. Vol. 115, № 10. P. 1306–1324.</w:t>
+      </w:r>
+    </w:p>
+    <w:p>
+      <w:pPr>
+        <w:pStyle w:val="ListNumber"/>
+        <w:spacing w:line="360" w:lineRule="auto" w:after="0"/>
+        <w:ind w:firstLine="0" w:left="425"/>
+        <w:jc w:val="both"/>
+      </w:pPr>
+      <w:r>
+        <w:rPr>
+          <w:rFonts w:ascii="Times New Roman" w:hAnsi="Times New Roman" w:cs="Times New Roman"/>
+          <w:sz w:val="28"/>
+        </w:rPr>
+        <w:t>Pan J., Tompkins W. J. A real-time QRS detection algorithm. IEEE Transactions on Biomedical Engineering. 1985. Vol. BME-32, № 3. P. 230–236.</w:t>
+      </w:r>
+    </w:p>
+    <w:p>
+      <w:pPr>
+        <w:pStyle w:val="ListNumber"/>
+        <w:spacing w:line="360" w:lineRule="auto" w:after="0"/>
+        <w:ind w:firstLine="0" w:left="425"/>
+        <w:jc w:val="both"/>
+      </w:pPr>
+      <w:r>
+        <w:rPr>
+          <w:rFonts w:ascii="Times New Roman" w:hAnsi="Times New Roman" w:cs="Times New Roman"/>
+          <w:sz w:val="28"/>
+        </w:rPr>
+        <w:t>Moody G. B., Mark R. G. The impact of the MIT-BIH Arrhythmia Database. IEEE Engineering in Medicine and Biology Magazine. 2001. Vol. 20, № 3. P. 45–50.</w:t>
+      </w:r>
+    </w:p>
+    <w:p>
+      <w:pPr>
+        <w:pStyle w:val="ListNumber"/>
+        <w:spacing w:line="360" w:lineRule="auto" w:after="0"/>
+        <w:ind w:firstLine="0" w:left="425"/>
+        <w:jc w:val="both"/>
+      </w:pPr>
+      <w:r>
+        <w:rPr>
+          <w:rFonts w:ascii="Times New Roman" w:hAnsi="Times New Roman" w:cs="Times New Roman"/>
+          <w:sz w:val="28"/>
+        </w:rPr>
+        <w:t>Goldberger A. L., Amaral L. A. N., Glass L. та ін. PhysioBank, PhysioToolkit, and PhysioNet: components of a new research resource for complex physiologic signals. Circulation. 2000. Vol. 101, № 23. P. e215–e220.</w:t>
+      </w:r>
+    </w:p>
+    <w:p>
+      <w:pPr>
+        <w:pStyle w:val="ListNumber"/>
+        <w:spacing w:line="360" w:lineRule="auto" w:after="0"/>
+        <w:ind w:firstLine="0" w:left="425"/>
+        <w:jc w:val="both"/>
+      </w:pPr>
+      <w:r>
+        <w:rPr>
+          <w:rFonts w:ascii="Times New Roman" w:hAnsi="Times New Roman" w:cs="Times New Roman"/>
+          <w:sz w:val="28"/>
+        </w:rPr>
+        <w:t>Digital Imaging and Communications in Medicine (DICOM). Supplement 30: Waveform Interchange. Rosslyn : NEMA, 2000.</w:t>
+      </w:r>
+    </w:p>
+    <w:p>
+      <w:pPr>
+        <w:pStyle w:val="ListNumber"/>
+        <w:spacing w:line="360" w:lineRule="auto" w:after="0"/>
+        <w:ind w:firstLine="0" w:left="425"/>
+        <w:jc w:val="both"/>
+      </w:pPr>
+      <w:r>
+        <w:rPr>
+          <w:rFonts w:ascii="Times New Roman" w:hAnsi="Times New Roman" w:cs="Times New Roman"/>
+          <w:sz w:val="28"/>
+        </w:rPr>
+        <w:t>HL7 Implementation Guide for CDA Release 2: Annotated ECG (aECG). Ann Arbor : Health Level Seven International, 2005.</w:t>
+      </w:r>
+    </w:p>
+    <w:p>
+      <w:pPr>
+        <w:pStyle w:val="ListNumber"/>
+        <w:spacing w:line="360" w:lineRule="auto" w:after="0"/>
+        <w:ind w:firstLine="0" w:left="425"/>
+        <w:jc w:val="both"/>
+      </w:pPr>
+      <w:r>
+        <w:rPr>
+          <w:rFonts w:ascii="Times New Roman" w:hAnsi="Times New Roman" w:cs="Times New Roman"/>
+          <w:sz w:val="28"/>
+        </w:rPr>
+        <w:t>EN 1064:2005. Health informatics. Standard communication protocol. Computer-assisted electrocardiography. Brussels : CEN, 2005.</w:t>
+      </w:r>
+    </w:p>
+    <w:p>
+      <w:pPr>
+        <w:pStyle w:val="ListNumber"/>
+        <w:spacing w:line="360" w:lineRule="auto" w:after="0"/>
+        <w:ind w:firstLine="0" w:left="425"/>
+        <w:jc w:val="both"/>
+      </w:pPr>
+      <w:r>
+        <w:rPr>
+          <w:rFonts w:ascii="Times New Roman" w:hAnsi="Times New Roman" w:cs="Times New Roman"/>
+          <w:sz w:val="28"/>
+        </w:rPr>
+        <w:t>ANSI/AAMI EC57:2012. Testing and reporting performance results of cardiac rhythm and ST segment measurement algorithms. Arlington : AAMI, 2013. 52 p.</w:t>
+      </w:r>
+    </w:p>
+    <w:p>
+      <w:pPr>
+        <w:pStyle w:val="ListNumber"/>
+        <w:spacing w:line="360" w:lineRule="auto" w:after="0"/>
+        <w:ind w:firstLine="0" w:left="425"/>
+        <w:jc w:val="both"/>
+      </w:pPr>
+      <w:r>
+        <w:rPr>
+          <w:rFonts w:ascii="Times New Roman" w:hAnsi="Times New Roman" w:cs="Times New Roman"/>
+          <w:sz w:val="28"/>
+        </w:rPr>
         <w:t>de Chazal P., O’Dwyer M., Reilly R. B. Automatic classification of heartbeats using ECG morphology and heartbeat interval features. IEEE Transactions on Biomedical Engineering. 2004. Vol. 51, № 7. P. 1196–1206.</w:t>
       </w:r>
     </w:p>
@@ -9288,7 +9478,7 @@
           <w:rFonts w:ascii="Times New Roman" w:hAnsi="Times New Roman" w:cs="Times New Roman"/>
           <w:sz w:val="28"/>
         </w:rPr>
-        <w:t>Kachuee M., Fazeli S., Sarrafzadeh M. ECG heartbeat classification: a deep transferable representation. 2018 IEEE International Conference on Healthcare Informatics (ICHI). New York, 2018. P. 443–444.</w:t>
+        <w:t>Acharya U. R., Oh S. L., Hagiwara Y., Tan J. H., Adam M., Gertych A., Tan R. S. A deep convolutional neural network model to classify heartbeats. Computers in Biology and Medicine. 2017. Vol. 89. P. 389–396.</w:t>
       </w:r>
     </w:p>
     <w:p>
@@ -9303,7 +9493,7 @@
           <w:rFonts w:ascii="Times New Roman" w:hAnsi="Times New Roman" w:cs="Times New Roman"/>
           <w:sz w:val="28"/>
         </w:rPr>
-        <w:t>Acharya U. R., Oh S. L., Hagiwara Y., Tan J. H., Adam M., Gertych A., Tan R. S. A deep convolutional neural network model to classify heartbeats. Computers in Biology and Medicine. 2017. Vol. 89. P. 389–396.</w:t>
+        <w:t>Kachuee M., Fazeli S., Sarrafzadeh M. ECG heartbeat classification: a deep transferable representation. 2018 IEEE International Conference on Healthcare Informatics (ICHI). New York, 2018. P. 443–444.</w:t>
       </w:r>
     </w:p>
     <w:p>
@@ -9333,7 +9523,7 @@
           <w:rFonts w:ascii="Times New Roman" w:hAnsi="Times New Roman" w:cs="Times New Roman"/>
           <w:sz w:val="28"/>
         </w:rPr>
-        <w:t>Pan J., Tompkins W. J. A real-time QRS detection algorithm. IEEE Transactions on Biomedical Engineering. 1985. Vol. BME-32, № 3. P. 230–236.</w:t>
+        <w:t>LeCun Y., Bengio Y., Hinton G. Deep learning. Nature. 2015. Vol. 521. P. 436–444.</w:t>
       </w:r>
     </w:p>
     <w:p>
@@ -9348,52 +9538,7 @@
           <w:rFonts w:ascii="Times New Roman" w:hAnsi="Times New Roman" w:cs="Times New Roman"/>
           <w:sz w:val="28"/>
         </w:rPr>
-        <w:t>Moody G. B., Mark R. G. The impact of the MIT-BIH Arrhythmia Database. IEEE Engineering in Medicine and Biology Magazine. 2001. Vol. 20, № 3. P. 45–50.</w:t>
-      </w:r>
-    </w:p>
-    <w:p>
-      <w:pPr>
-        <w:pStyle w:val="ListNumber"/>
-        <w:spacing w:line="360" w:lineRule="auto" w:after="0"/>
-        <w:ind w:firstLine="0" w:left="425"/>
-        <w:jc w:val="both"/>
-      </w:pPr>
-      <w:r>
-        <w:rPr>
-          <w:rFonts w:ascii="Times New Roman" w:hAnsi="Times New Roman" w:cs="Times New Roman"/>
-          <w:sz w:val="28"/>
-        </w:rPr>
-        <w:t>Goldberger A. L., Amaral L. A. N., Glass L. та ін. PhysioBank, PhysioToolkit, and PhysioNet: components of a new research resource for complex physiologic signals. Circulation. 2000. Vol. 101, № 23. P. e215–e220.</w:t>
-      </w:r>
-    </w:p>
-    <w:p>
-      <w:pPr>
-        <w:pStyle w:val="ListNumber"/>
-        <w:spacing w:line="360" w:lineRule="auto" w:after="0"/>
-        <w:ind w:firstLine="0" w:left="425"/>
-        <w:jc w:val="both"/>
-      </w:pPr>
-      <w:r>
-        <w:rPr>
-          <w:rFonts w:ascii="Times New Roman" w:hAnsi="Times New Roman" w:cs="Times New Roman"/>
-          <w:sz w:val="28"/>
-        </w:rPr>
-        <w:t>ANSI/AAMI EC57:2012. Testing and reporting performance results of cardiac rhythm and ST segment measurement algorithms. Arlington : AAMI, 2013. 52 p.</w:t>
-      </w:r>
-    </w:p>
-    <w:p>
-      <w:pPr>
-        <w:pStyle w:val="ListNumber"/>
-        <w:spacing w:line="360" w:lineRule="auto" w:after="0"/>
-        <w:ind w:firstLine="0" w:left="425"/>
-        <w:jc w:val="both"/>
-      </w:pPr>
-      <w:r>
-        <w:rPr>
-          <w:rFonts w:ascii="Times New Roman" w:hAnsi="Times New Roman" w:cs="Times New Roman"/>
-          <w:sz w:val="28"/>
-        </w:rPr>
-        <w:t>Kligfield P., Gettes L. S., Bailey J. J. та ін. Recommendations for the standardization and interpretation of the electrocardiogram. Circulation. 2007. Vol. 115, № 10. P. 1306–1324.</w:t>
+        <w:t>Mallat S. G. A theory for multiresolution signal decomposition: the wavelet representation. IEEE Transactions on Pattern Analysis and Machine Intelligence. 1989. Vol. 11, № 7. P. 674–693.</w:t>
       </w:r>
     </w:p>
     <w:p>
@@ -9423,7 +9568,22 @@
           <w:rFonts w:ascii="Times New Roman" w:hAnsi="Times New Roman" w:cs="Times New Roman"/>
           <w:sz w:val="28"/>
         </w:rPr>
-        <w:t>Mallat S. G. A theory for multiresolution signal decomposition: the wavelet representation. IEEE Transactions on Pattern Analysis and Machine Intelligence. 1989. Vol. 11, № 7. P. 674–693.</w:t>
+        <w:t>Pedregosa F., Varoquaux G., Gramfort A. та ін. Scikit-learn: machine learning in Python. Journal of Machine Learning Research. 2011. Vol. 12. P. 2825–2830.</w:t>
+      </w:r>
+    </w:p>
+    <w:p>
+      <w:pPr>
+        <w:pStyle w:val="ListNumber"/>
+        <w:spacing w:line="360" w:lineRule="auto" w:after="0"/>
+        <w:ind w:firstLine="0" w:left="425"/>
+        <w:jc w:val="both"/>
+      </w:pPr>
+      <w:r>
+        <w:rPr>
+          <w:rFonts w:ascii="Times New Roman" w:hAnsi="Times New Roman" w:cs="Times New Roman"/>
+          <w:sz w:val="28"/>
+        </w:rPr>
+        <w:t>Breiman L. Random forests. Machine Learning. 2001. Vol. 45, № 1. P. 5–32.</w:t>
       </w:r>
     </w:p>
     <w:p>
@@ -9453,7 +9613,7 @@
           <w:rFonts w:ascii="Times New Roman" w:hAnsi="Times New Roman" w:cs="Times New Roman"/>
           <w:sz w:val="28"/>
         </w:rPr>
-        <w:t>Breiman L. Random forests. Machine Learning. 2001. Vol. 45, № 1. P. 5–32.</w:t>
+        <w:t>Cortes C., Vapnik V. Support-vector networks. Machine Learning. 1995. Vol. 20, № 3. P. 273–297.</w:t>
       </w:r>
     </w:p>
     <w:p>
@@ -9468,7 +9628,7 @@
           <w:rFonts w:ascii="Times New Roman" w:hAnsi="Times New Roman" w:cs="Times New Roman"/>
           <w:sz w:val="28"/>
         </w:rPr>
-        <w:t>Cortes C., Vapnik V. Support-vector networks. Machine Learning. 1995. Vol. 20, № 3. P. 273–297.</w:t>
+        <w:t>Ioffe S., Szegedy C. Batch normalization: accelerating deep network training by reducing internal covariate shift. Proceedings of the 32nd International Conference on Machine Learning (ICML). Lille, 2015. P. 448–456.</w:t>
       </w:r>
     </w:p>
     <w:p>
@@ -9483,7 +9643,37 @@
           <w:rFonts w:ascii="Times New Roman" w:hAnsi="Times New Roman" w:cs="Times New Roman"/>
           <w:sz w:val="28"/>
         </w:rPr>
-        <w:t>LeCun Y., Bengio Y., Hinton G. Deep learning. Nature. 2015. Vol. 521. P. 436–444.</w:t>
+        <w:t>Paszke A., Gross S., Massa F. та ін. PyTorch: an imperative style, high-performance deep learning library. Advances in Neural Information Processing Systems 32. Vancouver, 2019. P. 8024–8035.</w:t>
+      </w:r>
+    </w:p>
+    <w:p>
+      <w:pPr>
+        <w:pStyle w:val="ListNumber"/>
+        <w:spacing w:line="360" w:lineRule="auto" w:after="0"/>
+        <w:ind w:firstLine="0" w:left="425"/>
+        <w:jc w:val="both"/>
+      </w:pPr>
+      <w:r>
+        <w:rPr>
+          <w:rFonts w:ascii="Times New Roman" w:hAnsi="Times New Roman" w:cs="Times New Roman"/>
+          <w:sz w:val="28"/>
+        </w:rPr>
+        <w:t>Harris C. R., Millman K. J., van der Walt S. J. та ін. Array programming with NumPy. Nature. 2020. Vol. 585. P. 357–362.</w:t>
+      </w:r>
+    </w:p>
+    <w:p>
+      <w:pPr>
+        <w:pStyle w:val="ListNumber"/>
+        <w:spacing w:line="360" w:lineRule="auto" w:after="0"/>
+        <w:ind w:firstLine="0" w:left="425"/>
+        <w:jc w:val="both"/>
+      </w:pPr>
+      <w:r>
+        <w:rPr>
+          <w:rFonts w:ascii="Times New Roman" w:hAnsi="Times New Roman" w:cs="Times New Roman"/>
+          <w:sz w:val="28"/>
+        </w:rPr>
+        <w:t>Virtanen P., Gommers R., Oliphant T. E. та ін. SciPy 1.0: fundamental algorithms for scientific computing in Python. Nature Methods. 2020. Vol. 17. P. 261–272.</w:t>
       </w:r>
     </w:p>
     <w:p>
@@ -9513,142 +9703,7 @@
           <w:rFonts w:ascii="Times New Roman" w:hAnsi="Times New Roman" w:cs="Times New Roman"/>
           <w:sz w:val="28"/>
         </w:rPr>
-        <w:t>Ioffe S., Szegedy C. Batch normalization: accelerating deep network training by reducing internal covariate shift. Proceedings of the 32nd International Conference on Machine Learning (ICML). Lille, 2015. P. 448–456.</w:t>
-      </w:r>
-    </w:p>
-    <w:p>
-      <w:pPr>
-        <w:pStyle w:val="ListNumber"/>
-        <w:spacing w:line="360" w:lineRule="auto" w:after="0"/>
-        <w:ind w:firstLine="0" w:left="425"/>
-        <w:jc w:val="both"/>
-      </w:pPr>
-      <w:r>
-        <w:rPr>
-          <w:rFonts w:ascii="Times New Roman" w:hAnsi="Times New Roman" w:cs="Times New Roman"/>
-          <w:sz w:val="28"/>
-        </w:rPr>
         <w:t>Wolpert D. H. Stacked generalization. Neural Networks. 1992. Vol. 5, № 2. P. 241–259.</w:t>
-      </w:r>
-    </w:p>
-    <w:p>
-      <w:pPr>
-        <w:pStyle w:val="ListNumber"/>
-        <w:spacing w:line="360" w:lineRule="auto" w:after="0"/>
-        <w:ind w:firstLine="0" w:left="425"/>
-        <w:jc w:val="both"/>
-      </w:pPr>
-      <w:r>
-        <w:rPr>
-          <w:rFonts w:ascii="Times New Roman" w:hAnsi="Times New Roman" w:cs="Times New Roman"/>
-          <w:sz w:val="28"/>
-        </w:rPr>
-        <w:t>Pedregosa F., Varoquaux G., Gramfort A. та ін. Scikit-learn: machine learning in Python. Journal of Machine Learning Research. 2011. Vol. 12. P. 2825–2830.</w:t>
-      </w:r>
-    </w:p>
-    <w:p>
-      <w:pPr>
-        <w:pStyle w:val="ListNumber"/>
-        <w:spacing w:line="360" w:lineRule="auto" w:after="0"/>
-        <w:ind w:firstLine="0" w:left="425"/>
-        <w:jc w:val="both"/>
-      </w:pPr>
-      <w:r>
-        <w:rPr>
-          <w:rFonts w:ascii="Times New Roman" w:hAnsi="Times New Roman" w:cs="Times New Roman"/>
-          <w:sz w:val="28"/>
-        </w:rPr>
-        <w:t>Paszke A., Gross S., Massa F. та ін. PyTorch: an imperative style, high-performance deep learning library. Advances in Neural Information Processing Systems 32. Vancouver, 2019. P. 8024–8035.</w:t>
-      </w:r>
-    </w:p>
-    <w:p>
-      <w:pPr>
-        <w:pStyle w:val="ListNumber"/>
-        <w:spacing w:line="360" w:lineRule="auto" w:after="0"/>
-        <w:ind w:firstLine="0" w:left="425"/>
-        <w:jc w:val="both"/>
-      </w:pPr>
-      <w:r>
-        <w:rPr>
-          <w:rFonts w:ascii="Times New Roman" w:hAnsi="Times New Roman" w:cs="Times New Roman"/>
-          <w:sz w:val="28"/>
-        </w:rPr>
-        <w:t>Harris C. R., Millman K. J., van der Walt S. J. та ін. Array programming with NumPy. Nature. 2020. Vol. 585. P. 357–362.</w:t>
-      </w:r>
-    </w:p>
-    <w:p>
-      <w:pPr>
-        <w:pStyle w:val="ListNumber"/>
-        <w:spacing w:line="360" w:lineRule="auto" w:after="0"/>
-        <w:ind w:firstLine="0" w:left="425"/>
-        <w:jc w:val="both"/>
-      </w:pPr>
-      <w:r>
-        <w:rPr>
-          <w:rFonts w:ascii="Times New Roman" w:hAnsi="Times New Roman" w:cs="Times New Roman"/>
-          <w:sz w:val="28"/>
-        </w:rPr>
-        <w:t>Virtanen P., Gommers R., Oliphant T. E. та ін. SciPy 1.0: fundamental algorithms for scientific computing in Python. Nature Methods. 2020. Vol. 17. P. 261–272.</w:t>
-      </w:r>
-    </w:p>
-    <w:p>
-      <w:pPr>
-        <w:pStyle w:val="ListNumber"/>
-        <w:spacing w:line="360" w:lineRule="auto" w:after="0"/>
-        <w:ind w:firstLine="0" w:left="425"/>
-        <w:jc w:val="both"/>
-      </w:pPr>
-      <w:r>
-        <w:rPr>
-          <w:rFonts w:ascii="Times New Roman" w:hAnsi="Times New Roman" w:cs="Times New Roman"/>
-          <w:sz w:val="28"/>
-        </w:rPr>
-        <w:t>Digital Imaging and Communications in Medicine (DICOM). Supplement 30: Waveform Interchange. Rosslyn : NEMA, 2000.</w:t>
-      </w:r>
-    </w:p>
-    <w:p>
-      <w:pPr>
-        <w:pStyle w:val="ListNumber"/>
-        <w:spacing w:line="360" w:lineRule="auto" w:after="0"/>
-        <w:ind w:firstLine="0" w:left="425"/>
-        <w:jc w:val="both"/>
-      </w:pPr>
-      <w:r>
-        <w:rPr>
-          <w:rFonts w:ascii="Times New Roman" w:hAnsi="Times New Roman" w:cs="Times New Roman"/>
-          <w:sz w:val="28"/>
-        </w:rPr>
-        <w:t>HL7 Implementation Guide for CDA Release 2: Annotated ECG (aECG). Ann Arbor : Health Level Seven International, 2005.</w:t>
-      </w:r>
-    </w:p>
-    <w:p>
-      <w:pPr>
-        <w:pStyle w:val="ListNumber"/>
-        <w:spacing w:line="360" w:lineRule="auto" w:after="0"/>
-        <w:ind w:firstLine="0" w:left="425"/>
-        <w:jc w:val="both"/>
-      </w:pPr>
-      <w:r>
-        <w:rPr>
-          <w:rFonts w:ascii="Times New Roman" w:hAnsi="Times New Roman" w:cs="Times New Roman"/>
-          <w:sz w:val="28"/>
-        </w:rPr>
-        <w:t>EN 1064:2005. Health informatics. Standard communication protocol. Computer-assisted electrocardiography. Brussels : CEN, 2005.</w:t>
-      </w:r>
-    </w:p>
-    <w:p>
-      <w:pPr>
-        <w:pStyle w:val="ListNumber"/>
-        <w:spacing w:line="360" w:lineRule="auto" w:after="0"/>
-        <w:ind w:firstLine="0" w:left="425"/>
-        <w:jc w:val="both"/>
-      </w:pPr>
-      <w:r>
-        <w:rPr>
-          <w:rFonts w:ascii="Times New Roman" w:hAnsi="Times New Roman" w:cs="Times New Roman"/>
-          <w:sz w:val="28"/>
-        </w:rPr>
-        <w:t>ДСТУ 8302:2015. Інформація та документація. Бібліографічне посилання. Загальні положення та правила складання. Київ : ДП «УкрНДНЦ», 2016. 17 с.</w:t>
       </w:r>
     </w:p>
     <w:p>
@@ -10177,7 +10232,7 @@
           <w:rFonts w:ascii="Times New Roman" w:hAnsi="Times New Roman" w:cs="Times New Roman"/>
           <w:sz w:val="28"/>
         </w:rPr>
-        <w:t>Рисунок Б.1 – Метод опорних векторів (одне відведення)</w:t>
+        <w:t>Рисунок Б.1 — Метод опорних векторів (одне відведення)</w:t>
       </w:r>
     </w:p>
     <w:p>
@@ -10233,7 +10288,7 @@
           <w:rFonts w:ascii="Times New Roman" w:hAnsi="Times New Roman" w:cs="Times New Roman"/>
           <w:sz w:val="28"/>
         </w:rPr>
-        <w:t>Рисунок Б.2 – Випадковий ліс (одне відведення)</w:t>
+        <w:t>Рисунок Б.2 — Випадковий ліс (одне відведення)</w:t>
       </w:r>
     </w:p>
     <w:p>
@@ -10289,7 +10344,7 @@
           <w:rFonts w:ascii="Times New Roman" w:hAnsi="Times New Roman" w:cs="Times New Roman"/>
           <w:sz w:val="28"/>
         </w:rPr>
-        <w:t>Рисунок Б.3 – Одновимірна згорткова мережа (одне відведення)</w:t>
+        <w:t>Рисунок Б.3 — Одновимірна згорткова мережа (одне відведення)</w:t>
       </w:r>
     </w:p>
     <w:p>
@@ -10345,7 +10400,7 @@
           <w:rFonts w:ascii="Times New Roman" w:hAnsi="Times New Roman" w:cs="Times New Roman"/>
           <w:sz w:val="28"/>
         </w:rPr>
-        <w:t>Рисунок Б.4 – Гібридний класифікатор (одне відведення)</w:t>
+        <w:t>Рисунок Б.4 — Гібридний класифікатор (одне відведення)</w:t>
       </w:r>
     </w:p>
     <w:p>
@@ -10401,7 +10456,7 @@
           <w:rFonts w:ascii="Times New Roman" w:hAnsi="Times New Roman" w:cs="Times New Roman"/>
           <w:sz w:val="28"/>
         </w:rPr>
-        <w:t>Рисунок Б.5 – XGBoost (два відведення)</w:t>
+        <w:t>Рисунок Б.5 — XGBoost (два відведення)</w:t>
       </w:r>
     </w:p>
     <w:sectPr>

</xml_diff>

<commit_message>
Second compliance pass over thesis vs KNU methodology
Lists (§3.9): use "—" (тире) markers, intro ends with ":", items lowercase
  and ";"-separated (last "."); applied to завдання, новизна, формати, висновки.
Numbers (§3.14): physical-quantity ranges as "від N до M" ("від 5 до 15 Гц",
  "від 5 до 10 відсоткових пунктів"); single-digit count in words ("п’яти смуг").
Appendices (§3.16): two-line heading "ДОДАТОК X" + title in normal case (no period).
Abbreviations (§2.4): dropped 5 entries never used in text/figures
  (ВСР, ЧСС, МН, ПЗ, BN).
Cross-references: fixed wrong table ref in §4.8 (4.4 → 4.5); added missing
  in-text reference to таблиця 4.4 (§3.8); reordered figure mentions in §4.7.
Style (§3.6): replaced "(F1 = 0)" running-text math sign with words.
Renamed §3.5 heading to avoid clash with the "гібридний класифікатор" term;
  реферат: "дві наукові новизни" → "дві складові наукової новизни".

https://claude.ai/code/session_01S5qNwg7X8K6zJLh7vUsNoh
</commit_message>
<xml_diff>
--- a/thesis/Кваліфікаційна_робота_Макаренко.docx
+++ b/thesis/Кваліфікаційна_робота_Макаренко.docx
@@ -483,7 +483,7 @@
           <w:i w:val="0"/>
           <w:sz w:val="28"/>
         </w:rPr>
-        <w:t>Результати роботи. Монолітний прототип, успадкований від попередньої курсової роботи, переструктуровано в модульний пакет ekg із розділенням шарів зчитування форматів, обробки сигналу, виділення ознак, моделей і сервісів. Реалізовано повний конвеєр навчання та оцінювання на базі MIT-BIH Arrhythmia Database за міжпацієнтним поділом DS1/DS2. Навчено й порівняно сім моделей; найкращий збалансований показник macro-F1 0,466 досягнуто методом опорних векторів на двовідвідних ознаках. Запропоновано дві наукові новизни: двопотоковий гібридний класифікатор із пізнім злиттям, що забезпечує найвищу чутливість до зливних скорочень (повнота 0,89), та бенчмарк багатоформатної стійкості, який доводить, що перетворення сигналу через формати CSV і EDF не погіршує якість класифікації (узгодженість міток 100 % для CSV і не менше 99,3 % для EDF). Систему доповнено REST-API та інтерфейсом командного рядка.</w:t>
+        <w:t>Результати роботи. Монолітний прототип, успадкований від попередньої курсової роботи, переструктуровано в модульний пакет ekg із розділенням шарів зчитування форматів, обробки сигналу, виділення ознак, моделей і сервісів. Реалізовано повний конвеєр навчання та оцінювання на базі MIT-BIH Arrhythmia Database за міжпацієнтним поділом DS1/DS2. Навчено й порівняно сім моделей; найкращий збалансований показник macro-F1 0,466 досягнуто методом опорних векторів на двовідвідних ознаках. Сформульовано дві складові наукової новизни: двопотоковий гібридний класифікатор із пізнім злиттям, що забезпечує найвищу чутливість до зливних скорочень (повнота 0,89), та бенчмарк багатоформатної стійкості, який доводить, що перетворення сигналу через формати CSV і EDF не погіршує якість класифікації (узгодженість міток 100 % для CSV і не менше 99,3 % для EDF). Систему доповнено REST-API та інтерфейсом командного рядка.</w:t>
       </w:r>
     </w:p>
     <w:p>
@@ -546,63 +546,7 @@
           <w:rFonts w:ascii="Times New Roman" w:hAnsi="Times New Roman" w:cs="Times New Roman"/>
           <w:sz w:val="28"/>
         </w:rPr>
-        <w:t>ВСР — варіабельність серцевого ритму (heart rate variability, HRV);</w:t>
-      </w:r>
-    </w:p>
-    <w:p>
-      <w:pPr>
-        <w:spacing w:line="360" w:lineRule="auto" w:after="0"/>
-        <w:ind w:firstLine="720"/>
-        <w:jc w:val="both"/>
-      </w:pPr>
-      <w:r>
-        <w:rPr>
-          <w:rFonts w:ascii="Times New Roman" w:hAnsi="Times New Roman" w:cs="Times New Roman"/>
-          <w:sz w:val="28"/>
-        </w:rPr>
         <w:t>ЕКГ — електрокардіограма, електрокардіографія;</w:t>
-      </w:r>
-    </w:p>
-    <w:p>
-      <w:pPr>
-        <w:spacing w:line="360" w:lineRule="auto" w:after="0"/>
-        <w:ind w:firstLine="720"/>
-        <w:jc w:val="both"/>
-      </w:pPr>
-      <w:r>
-        <w:rPr>
-          <w:rFonts w:ascii="Times New Roman" w:hAnsi="Times New Roman" w:cs="Times New Roman"/>
-          <w:sz w:val="28"/>
-        </w:rPr>
-        <w:t>МН — машинне навчання;</w:t>
-      </w:r>
-    </w:p>
-    <w:p>
-      <w:pPr>
-        <w:spacing w:line="360" w:lineRule="auto" w:after="0"/>
-        <w:ind w:firstLine="720"/>
-        <w:jc w:val="both"/>
-      </w:pPr>
-      <w:r>
-        <w:rPr>
-          <w:rFonts w:ascii="Times New Roman" w:hAnsi="Times New Roman" w:cs="Times New Roman"/>
-          <w:sz w:val="28"/>
-        </w:rPr>
-        <w:t>ПЗ — програмне забезпечення;</w:t>
-      </w:r>
-    </w:p>
-    <w:p>
-      <w:pPr>
-        <w:spacing w:line="360" w:lineRule="auto" w:after="0"/>
-        <w:ind w:firstLine="720"/>
-        <w:jc w:val="both"/>
-      </w:pPr>
-      <w:r>
-        <w:rPr>
-          <w:rFonts w:ascii="Times New Roman" w:hAnsi="Times New Roman" w:cs="Times New Roman"/>
-          <w:sz w:val="28"/>
-        </w:rPr>
-        <w:t>ЧСС — частота серцевих скорочень;</w:t>
       </w:r>
     </w:p>
     <w:p>
@@ -659,20 +603,6 @@
           <w:sz w:val="28"/>
         </w:rPr>
         <w:t>BiLSTM — двонапрямлена довга короткочасна пам’ять (bidirectional long short-term memory);</w:t>
-      </w:r>
-    </w:p>
-    <w:p>
-      <w:pPr>
-        <w:spacing w:line="360" w:lineRule="auto" w:after="0"/>
-        <w:ind w:firstLine="720"/>
-        <w:jc w:val="both"/>
-      </w:pPr>
-      <w:r>
-        <w:rPr>
-          <w:rFonts w:ascii="Times New Roman" w:hAnsi="Times New Roman" w:cs="Times New Roman"/>
-          <w:sz w:val="28"/>
-        </w:rPr>
-        <w:t>BN — пакетна нормалізація (batch normalization);</w:t>
       </w:r>
     </w:p>
     <w:p>
@@ -1099,7 +1029,7 @@
           <w:rFonts w:ascii="Times New Roman" w:hAnsi="Times New Roman" w:cs="Times New Roman"/>
           <w:sz w:val="28"/>
         </w:rPr>
-        <w:t>Метою роботи є розроблення уніфікованої системи обробки та класифікації ЕКГ-сигналів різних форматів із застосуванням методів машинного навчання. Для досягнення мети поставлено такі завдання.</w:t>
+        <w:t>Метою роботи є розроблення уніфікованої системи обробки та класифікації ЕКГ-сигналів різних форматів із застосуванням методів машинного навчання. Для досягнення мети поставлено такі завдання:</w:t>
       </w:r>
     </w:p>
     <w:p>
@@ -1113,7 +1043,7 @@
           <w:rFonts w:ascii="Times New Roman" w:hAnsi="Times New Roman" w:cs="Times New Roman"/>
           <w:sz w:val="28"/>
         </w:rPr>
-        <w:t>– Проаналізувати предметну область: будову ЕКГ-сигналу, формати зберігання, стандарт класифікації AAMI та сучасні методи класифікації серцевих скорочень.</w:t>
+        <w:t>— проаналізувати предметну область: будову ЕКГ-сигналу, формати зберігання, стандарт класифікації AAMI та сучасні методи класифікації серцевих скорочень;</w:t>
       </w:r>
     </w:p>
     <w:p>
@@ -1127,7 +1057,7 @@
           <w:rFonts w:ascii="Times New Roman" w:hAnsi="Times New Roman" w:cs="Times New Roman"/>
           <w:sz w:val="28"/>
         </w:rPr>
-        <w:t>– Переструктурувати успадкований монолітний код у модульний пакет із чітким розділенням шарів зчитування, обробки, ознак і моделей.</w:t>
+        <w:t>— переструктурувати успадкований монолітний код у модульний пакет із чітким розділенням шарів зчитування, обробки, ознак і моделей;</w:t>
       </w:r>
     </w:p>
     <w:p>
@@ -1141,7 +1071,7 @@
           <w:rFonts w:ascii="Times New Roman" w:hAnsi="Times New Roman" w:cs="Times New Roman"/>
           <w:sz w:val="28"/>
         </w:rPr>
-        <w:t>– Реалізувати завантаження бази MIT-BIH і коректний міжпацієнтний поділ записів на навчальну та тестову підмножини.</w:t>
+        <w:t>— реалізувати завантаження бази MIT-BIH і коректний міжпацієнтний поділ записів на навчальну та тестову підмножини;</w:t>
       </w:r>
     </w:p>
     <w:p>
@@ -1155,7 +1085,7 @@
           <w:rFonts w:ascii="Times New Roman" w:hAnsi="Times New Roman" w:cs="Times New Roman"/>
           <w:sz w:val="28"/>
         </w:rPr>
-        <w:t>– Розробити модуль виділення ознак окремого удару й модуль сегментації вікон сигналу навколо R-піків.</w:t>
+        <w:t>— розробити модуль виділення ознак окремого удару й модуль сегментації вікон сигналу навколо R-піків;</w:t>
       </w:r>
     </w:p>
     <w:p>
@@ -1169,7 +1099,7 @@
           <w:rFonts w:ascii="Times New Roman" w:hAnsi="Times New Roman" w:cs="Times New Roman"/>
           <w:sz w:val="28"/>
         </w:rPr>
-        <w:t>– Навчити та порівняти класичні (XGBoost, випадковий ліс, метод опорних векторів) і глибокі (1D-CNN, CNN-BiLSTM) моделі.</w:t>
+        <w:t>— навчити та порівняти класичні (XGBoost, випадковий ліс, метод опорних векторів) і глибокі (1D-CNN, CNN-BiLSTM) моделі;</w:t>
       </w:r>
     </w:p>
     <w:p>
@@ -1183,7 +1113,7 @@
           <w:rFonts w:ascii="Times New Roman" w:hAnsi="Times New Roman" w:cs="Times New Roman"/>
           <w:sz w:val="28"/>
         </w:rPr>
-        <w:t>– Запропонувати й реалізувати двопотоковий гібридний класифікатор із пізнім злиттям ознакового та сигнального потоків.</w:t>
+        <w:t>— запропонувати й реалізувати двопотоковий гібридний класифікатор із пізнім злиттям ознакового та сигнального потоків;</w:t>
       </w:r>
     </w:p>
     <w:p>
@@ -1197,7 +1127,7 @@
           <w:rFonts w:ascii="Times New Roman" w:hAnsi="Times New Roman" w:cs="Times New Roman"/>
           <w:sz w:val="28"/>
         </w:rPr>
-        <w:t>– Розробити бенчмарк багатоформатної стійкості, що кількісно оцінює зміну точності після перетворення сигналу між форматами.</w:t>
+        <w:t>— розробити бенчмарк багатоформатної стійкості, що кількісно оцінює зміну точності після перетворення сигналу між форматами;</w:t>
       </w:r>
     </w:p>
     <w:p>
@@ -1211,7 +1141,7 @@
           <w:rFonts w:ascii="Times New Roman" w:hAnsi="Times New Roman" w:cs="Times New Roman"/>
           <w:sz w:val="28"/>
         </w:rPr>
-        <w:t>– Реалізувати REST-API та інтерфейс командного рядка для практичного застосування системи.</w:t>
+        <w:t>— реалізувати REST-API та інтерфейс командного рядка для практичного застосування системи.</w:t>
       </w:r>
     </w:p>
     <w:p>
@@ -1255,7 +1185,7 @@
           <w:rFonts w:ascii="Times New Roman" w:hAnsi="Times New Roman" w:cs="Times New Roman"/>
           <w:sz w:val="28"/>
         </w:rPr>
-        <w:t>До основних нових результатів роботи належать такі.</w:t>
+        <w:t>До основних нових результатів роботи належать такі:</w:t>
       </w:r>
     </w:p>
     <w:p>
@@ -1269,7 +1199,7 @@
           <w:rFonts w:ascii="Times New Roman" w:hAnsi="Times New Roman" w:cs="Times New Roman"/>
           <w:sz w:val="28"/>
         </w:rPr>
-        <w:t>– Уперше для цієї системи запропоновано двопотоковий гібридний класифікатор, що поєднує градієнтний бустинг над ручними ознаками й згорткову мережу над сирим сигналом через навчений мета-класифікатор пізнього злиття; показано, що така схема дає найвищу серед усіх розглянутих моделей чутливість до клінічно важливих зливних скорочень.</w:t>
+        <w:t>— уперше для цієї системи запропоновано двопотоковий гібридний класифікатор, що поєднує градієнтний бустинг над ручними ознаками й згорткову мережу над сирим сигналом через навчений мета-класифікатор пізнього злиття; показано, що така схема дає найвищу серед усіх розглянутих моделей чутливість до клінічно важливих зливних скорочень;</w:t>
       </w:r>
     </w:p>
     <w:p>
@@ -1283,7 +1213,7 @@
           <w:rFonts w:ascii="Times New Roman" w:hAnsi="Times New Roman" w:cs="Times New Roman"/>
           <w:sz w:val="28"/>
         </w:rPr>
-        <w:t>– Запропоновано та реалізовано бенчмарк багатоформатної стійкості класифікації, який кількісно підтверджує, що зведення сигналу до спільного подання через формати CSV та EDF не погіршує якість класифікації; цей результат безпосередньо обґрунтовує означення «уніфікована» та «багатоформатна» у назві системи.</w:t>
+        <w:t>— запропоновано та реалізовано бенчмарк багатоформатної стійкості класифікації, який кількісно підтверджує, що зведення сигналу до спільного подання через формати CSV та EDF не погіршує якість класифікації; цей результат безпосередньо обґрунтовує означення «уніфікована» та «багатоформатна» у назві системи.</w:t>
       </w:r>
     </w:p>
     <w:p>
@@ -1465,7 +1395,7 @@
           <w:i w:val="0"/>
           <w:sz w:val="28"/>
         </w:rPr>
-        <w:t>Корисний ЕКГ-сигнал займає смугу приблизно від 0,05 до 100 Гц, а енергія комплексу QRS зосереджена переважно в смузі 5–15 Гц. Амплітуда сигналу становить близько 1 мВ, тоді як завади (мережева наводка 50 Гц, м’язовий тремор, дрейф ізолінії від дихання) можуть бути порівнянними за рівнем із корисним сигналом. Це робить попередню фільтрацію обов’язковою умовою достовірного аналізу й пояснює, чому виявлення R-піків виконують у вузькій смузі QRS.</w:t>
+        <w:t>Корисний ЕКГ-сигнал займає смугу приблизно від 0,05 до 100 Гц, а енергія комплексу QRS зосереджена переважно в смузі від 5 до 15 Гц. Амплітуда сигналу становить близько 1 мВ, тоді як завади (мережева наводка 50 Гц, м’язовий тремор, дрейф ізолінії від дихання) можуть бути порівнянними за рівнем із корисним сигналом. Це робить попередню фільтрацію обов’язковою умовою достовірного аналізу й пояснює, чому виявлення R-піків виконують у вузькій смузі QRS.</w:t>
       </w:r>
     </w:p>
     <w:p>
@@ -1530,7 +1460,7 @@
           <w:i w:val="0"/>
           <w:sz w:val="28"/>
         </w:rPr>
-        <w:t>Різнорідність форматів є практичною перешкодою для побудови єдиної системи аналізу. Кожний формат має власну модель даних, спосіб кодування відліків і набір метаданих.</w:t>
+        <w:t>Різнорідність форматів є практичною перешкодою для побудови єдиної системи аналізу. Кожний формат має власну модель даних, спосіб кодування відліків і набір метаданих:</w:t>
       </w:r>
     </w:p>
     <w:p>
@@ -1544,7 +1474,7 @@
           <w:rFonts w:ascii="Times New Roman" w:hAnsi="Times New Roman" w:cs="Times New Roman"/>
           <w:sz w:val="28"/>
         </w:rPr>
-        <w:t>– WFDB — формат і бібліотека PhysioNet; запис складається з заголовка .hea, бінарного файлу відліків .dat та файлу анотацій. Саме у цьому форматі поширюється MIT-BIH [3; 4].</w:t>
+        <w:t>— WFDB — формат і бібліотека PhysioNet; запис складається з заголовка .hea, бінарного файлу відліків .dat та файлу анотацій; саме у цьому форматі поширюється MIT-BIH [3; 4];</w:t>
       </w:r>
     </w:p>
     <w:p>
@@ -1558,7 +1488,7 @@
           <w:rFonts w:ascii="Times New Roman" w:hAnsi="Times New Roman" w:cs="Times New Roman"/>
           <w:sz w:val="28"/>
         </w:rPr>
-        <w:t>– DICOM (доповнення Waveform) зберігає сигнали як частину медичного об’єкта поряд із демографічними даними пацієнта [5].</w:t>
+        <w:t>— DICOM (доповнення Waveform) зберігає сигнали як частину медичного об’єкта поряд із демографічними даними пацієнта [5];</w:t>
       </w:r>
     </w:p>
     <w:p>
@@ -1572,7 +1502,7 @@
           <w:rFonts w:ascii="Times New Roman" w:hAnsi="Times New Roman" w:cs="Times New Roman"/>
           <w:sz w:val="28"/>
         </w:rPr>
-        <w:t>– EDF/BDF — поширений формат фізіологічних записів із 16-бітним лінійним квантуванням відліків.</w:t>
+        <w:t>— EDF/BDF — поширений формат фізіологічних записів із 16-бітним лінійним квантуванням відліків;</w:t>
       </w:r>
     </w:p>
     <w:p>
@@ -1586,7 +1516,7 @@
           <w:rFonts w:ascii="Times New Roman" w:hAnsi="Times New Roman" w:cs="Times New Roman"/>
           <w:sz w:val="28"/>
         </w:rPr>
-        <w:t>– HL7 aECG — текстове подання у форматі XML, призначене для обміну анотованими ЕКГ між інформаційними системами [6].</w:t>
+        <w:t>— HL7 aECG — текстове подання у форматі XML, призначене для обміну анотованими ЕКГ між інформаційними системами [6];</w:t>
       </w:r>
     </w:p>
     <w:p>
@@ -1600,7 +1530,7 @@
           <w:rFonts w:ascii="Times New Roman" w:hAnsi="Times New Roman" w:cs="Times New Roman"/>
           <w:sz w:val="28"/>
         </w:rPr>
-        <w:t>– SCP-ECG (EN 1064) — компактний бінарний галузевий стандарт для цифрової електрокардіографії [7].</w:t>
+        <w:t>— SCP-ECG (EN 1064) — компактний бінарний галузевий стандарт для цифрової електрокардіографії [7];</w:t>
       </w:r>
     </w:p>
     <w:p>
@@ -1614,7 +1544,7 @@
           <w:rFonts w:ascii="Times New Roman" w:hAnsi="Times New Roman" w:cs="Times New Roman"/>
           <w:sz w:val="28"/>
         </w:rPr>
-        <w:t>– CSV — простий текстовий формат, зручний для обміну та налагодження.</w:t>
+        <w:t>— CSV — простий текстовий формат, зручний для обміну та налагодження.</w:t>
       </w:r>
     </w:p>
     <w:p>
@@ -3527,7 +3457,7 @@
                 <w:b w:val="0"/>
                 <w:sz w:val="22"/>
               </w:rPr>
-              <w:t>середнє, відхилення та енергія для 5 смуг 4-рівневого DWT</w:t>
+              <w:t>середнє, відхилення та енергія для п’яти смуг 4-рівневого DWT</w:t>
             </w:r>
           </w:p>
         </w:tc>
@@ -3877,7 +3807,7 @@
           <w:color w:val="000000"/>
           <w:sz w:val="28"/>
         </w:rPr>
-        <w:t>3.5 Гібридна модель CNN-BiLSTM</w:t>
+        <w:t>3.5 Згорткова мережа з рекурентним шаром (CNN-BiLSTM)</w:t>
       </w:r>
     </w:p>
     <w:p>
@@ -4130,7 +4060,7 @@
           <w:i w:val="0"/>
           <w:sz w:val="28"/>
         </w:rPr>
-        <w:t>Зведені показники одновідвідних моделей наведено в таблиці 4.1. Базова лінія на основі правил очікувано слабка: вона зовсім не виявляє шлуночкових і зливних скорочень (F1 = 0). Найвищу загальну точність (0,929) показує випадковий ліс, проте його macro-F1 лише 0,374, бо він майже завжди передбачає клас N. Найкращий збалансований показник серед одновідвідних моделей належить методу опорних векторів (macro-F1 0,461).</w:t>
+        <w:t>Зведені показники одновідвідних моделей наведено в таблиці 4.1. Базова лінія на основі правил очікувано слабка: вона зовсім не виявляє шлуночкових і зливних скорочень (F1 дорівнює нулю). Найвищу загальну точність (0,929) показує випадковий ліс, проте його macro-F1 лише 0,374, бо він майже завжди передбачає клас N. Найкращий збалансований показник серед одновідвідних моделей належить методу опорних векторів (macro-F1 0,461).</w:t>
       </w:r>
     </w:p>
     <w:p>
@@ -5458,7 +5388,7 @@
           <w:i w:val="0"/>
           <w:sz w:val="28"/>
         </w:rPr>
-        <w:t>Недостатня якість глибоких моделей пояснюється сукупністю причин: навчання обмеженою кількістю епох на процесорі, використання лише одного відведення та відсутність аугментації даних. Подібні значення для коротко навчених одновідвідних мереж узгоджуються з літературою [13]; за повноцінного навчання на графічному прискорювачі очікуваний приріст macro-F1 згорткових моделей становить 5–10 відсоткових пунктів, тоді як класичні моделі вже збігаються за кілька секунд навчання й приросту не дадуть.</w:t>
+        <w:t>Недостатня якість глибоких моделей пояснюється сукупністю причин: навчання обмеженою кількістю епох на процесорі, використання лише одного відведення та відсутність аугментації даних. Подібні значення для коротко навчених одновідвідних мереж узгоджуються з літературою [13]; за повноцінного навчання на графічному прискорювачі очікуваний приріст macro-F1 згорткових моделей становить від 5 до 10 відсоткових пунктів, тоді як класичні моделі вже збігаються за кілька секунд навчання й приросту не дадуть.</w:t>
       </w:r>
     </w:p>
     <w:p>
@@ -7301,7 +7231,7 @@
           <w:i w:val="0"/>
           <w:sz w:val="28"/>
         </w:rPr>
-        <w:t>Означення «уніфікована багатоформатна» у назві системи має сенс лише тоді, коли якість класифікації зберігається після перетворення між форматами. Для перевірки цього розроблено окремий бенчмарк. Для кожного запису DS2 сигнал зчитують у вихідному форматі WFDB і класифікують найкращою моделлю, отримуючи еталонні передбачення. Потім той самий сигнал експортують у формат CSV або EDF, повторно зчитують через спільне подання, заново сегментують навколо тих самих фізичних позицій R-піків і знову класифікують. Порівнюють узгодженість міток (частку ударів, для яких передбачення після перетворення збігається з еталонним), точність і середню абсолютну різницю сигналу.</w:t>
+        <w:t>Означення «уніфікована багатоформатна» у назві системи має сенс лише тоді, коли якість класифікації зберігається після перетворення між форматами. Для перевірки цього розроблено окремий бенчмарк. Для кожного запису DS2 сигнал зчитують у вихідному форматі WFDB і класифікують найкращою моделлю, отримуючи еталонні передбачення. Потім той самий сигнал експортують у формат CSV або EDF, повторно зчитують через спільне подання, заново сегментують навколо тих самих фізичних позицій R-піків і знову класифікують. Порівнюють узгодженість міток (частку ударів, для яких передбачення після перетворення збігається з еталонним), точність і середню абсолютну різницю сигналу. Результати зведено в таблиці 4.4.</w:t>
       </w:r>
     </w:p>
     <w:p>
@@ -8367,7 +8297,7 @@
           <w:i w:val="0"/>
           <w:sz w:val="28"/>
         </w:rPr>
-        <w:t>Перетворення через CSV виявляється точним для класифікації: за наявності стовпця часу й окремих стовпців значень для кожного відведення текстові числа з шістьма знаками після коми відновлюються без втрат, узгодженість міток становить 100 % для всіх моделей, а точність на DS2 збігається з вихідною. Перетворення через EDF майже без втрат: середня абсолютна різниця сигналу не перевищує 0,00004 (рівень шуму 16-бітного квантування), а узгодженість міток становить не менше 99,3 %. Поодинокі удари, що змінюють мітку, розташовані на межі рішення і змінюють точність у межах статистичної похибки. Узгодженість сигналу до й після перетворення ілюструє рисунок 4.10, а зведене порівняння форматів — рисунок 4.9.</w:t>
+        <w:t>Перетворення через CSV виявляється точним для класифікації: за наявності стовпця часу й окремих стовпців значень для кожного відведення текстові числа з шістьма знаками після коми відновлюються без втрат, узгодженість міток становить 100 % для всіх моделей, а точність на DS2 збігається з вихідною. Перетворення через EDF майже без втрат: середня абсолютна різниця сигналу не перевищує 0,00004 (рівень шуму 16-бітного квантування), а узгодженість міток становить не менше 99,3 %. Поодинокі удари, що змінюють мітку, розташовані на межі рішення і змінюють точність у межах статистичної похибки. Зведене порівняння форматів наведено на рисунку 4.9, а узгодженість форми сигналу до й після перетворення — на рисунку 4.10.</w:t>
       </w:r>
     </w:p>
     <w:p>
@@ -8528,7 +8458,7 @@
           <w:i w:val="0"/>
           <w:sz w:val="28"/>
         </w:rPr>
-        <w:t>У таблиці 4.4 показники роботи зіставлено з опублікованими для того самого міжпацієнтного п’ятикласового протоколу. Отримані значення macro-F1 перебувають усередині опублікованого діапазону, попри істотно простіший набір ознак, ніж у первинній праці de Chazal.</w:t>
+        <w:t>У таблиці 4.5 показники роботи зіставлено з опублікованими для того самого міжпацієнтного п’ятикласового протоколу. Отримані значення macro-F1 перебувають усередині опублікованого діапазону, попри істотно простіший набір ознак, ніж у первинній праці de Chazal.</w:t>
       </w:r>
     </w:p>
     <w:p>
@@ -9167,7 +9097,7 @@
           <w:i w:val="0"/>
           <w:sz w:val="28"/>
         </w:rPr>
-        <w:t>У кваліфікаційній роботі розв’язано задачу побудови уніфікованої системи обробки та класифікації ЕКГ-сигналів різних форматів із застосуванням методів машинного навчання. Досягнуто всіх поставлених завдань.</w:t>
+        <w:t>У кваліфікаційній роботі розв’язано задачу побудови уніфікованої системи обробки та класифікації ЕКГ-сигналів різних форматів із застосуванням методів машинного навчання. Досягнуто всіх поставлених завдань:</w:t>
       </w:r>
     </w:p>
     <w:p>
@@ -9181,7 +9111,7 @@
           <w:rFonts w:ascii="Times New Roman" w:hAnsi="Times New Roman" w:cs="Times New Roman"/>
           <w:sz w:val="28"/>
         </w:rPr>
-        <w:t>– Проаналізовано предметну область: будову ЕКГ, формати зберігання, стандарт класифікації AAMI та сучасні методи; обґрунтовано вибір міжпацієнтного протоколу й показника macro-F1.</w:t>
+        <w:t>— проаналізовано предметну область: будову ЕКГ, формати зберігання, стандарт класифікації AAMI та сучасні методи; обґрунтовано вибір міжпацієнтного протоколу й показника macro-F1;</w:t>
       </w:r>
     </w:p>
     <w:p>
@@ -9195,7 +9125,7 @@
           <w:rFonts w:ascii="Times New Roman" w:hAnsi="Times New Roman" w:cs="Times New Roman"/>
           <w:sz w:val="28"/>
         </w:rPr>
-        <w:t>– Успадкований монолітний прототип переструктуровано в модульний пакет ekg зі збереженням поведінки перевірених компонентів обробки сигналу.</w:t>
+        <w:t>— успадкований монолітний прототип переструктуровано в модульний пакет ekg зі збереженням поведінки перевірених компонентів обробки сигналу;</w:t>
       </w:r>
     </w:p>
     <w:p>
@@ -9209,7 +9139,7 @@
           <w:rFonts w:ascii="Times New Roman" w:hAnsi="Times New Roman" w:cs="Times New Roman"/>
           <w:sz w:val="28"/>
         </w:rPr>
-        <w:t>– Реалізовано повний конвеєр на базі MIT-BIH із коректним поділом DS1/DS2, модулями сегментації ударів і виділення 35-вимірного ознакового вектора.</w:t>
+        <w:t>— реалізовано повний конвеєр на базі MIT-BIH із коректним поділом DS1/DS2, модулями сегментації ударів і виділення 35-вимірного ознакового вектора;</w:t>
       </w:r>
     </w:p>
     <w:p>
@@ -9223,7 +9153,7 @@
           <w:rFonts w:ascii="Times New Roman" w:hAnsi="Times New Roman" w:cs="Times New Roman"/>
           <w:sz w:val="28"/>
         </w:rPr>
-        <w:t>– Навчено й порівняно сім моделей; найкращий збалансований показник macro-F1 0,466 досягнуто методом опорних векторів на двох відведеннях, що відповідає рівню опублікованих результатів для цього протоколу.</w:t>
+        <w:t>— навчено й порівняно сім моделей; найкращий збалансований показник macro-F1 0,466 досягнуто методом опорних векторів на двох відведеннях, що відповідає рівню опублікованих результатів для цього протоколу;</w:t>
       </w:r>
     </w:p>
     <w:p>
@@ -9237,7 +9167,7 @@
           <w:rFonts w:ascii="Times New Roman" w:hAnsi="Times New Roman" w:cs="Times New Roman"/>
           <w:sz w:val="28"/>
         </w:rPr>
-        <w:t>– Запропоновано двопотоковий гібридний класифікатор із пізнім злиттям, який забезпечує найвищу серед усіх моделей чутливість до зливних скорочень (повнота 0,89) — клінічно найважливіший показник.</w:t>
+        <w:t>— запропоновано двопотоковий гібридний класифікатор із пізнім злиттям, який забезпечує найвищу серед усіх моделей чутливість до зливних скорочень (повнота 0,89) — клінічно найважливіший показник;</w:t>
       </w:r>
     </w:p>
     <w:p>
@@ -9251,7 +9181,7 @@
           <w:rFonts w:ascii="Times New Roman" w:hAnsi="Times New Roman" w:cs="Times New Roman"/>
           <w:sz w:val="28"/>
         </w:rPr>
-        <w:t>– Розроблено бенчмарк багатоформатної стійкості, що кількісно довів збереження якості класифікації після перетворення через формати CSV (узгодженість міток 100 %) та EDF (не менше 99,3 %).</w:t>
+        <w:t>— розроблено бенчмарк багатоформатної стійкості, що кількісно довів збереження якості класифікації після перетворення через формати CSV (узгодженість міток 100 %) та EDF (не менше 99,3 %);</w:t>
       </w:r>
     </w:p>
     <w:p>
@@ -9265,7 +9195,7 @@
           <w:rFonts w:ascii="Times New Roman" w:hAnsi="Times New Roman" w:cs="Times New Roman"/>
           <w:sz w:val="28"/>
         </w:rPr>
-        <w:t>– Реалізовано REST-API та інтерфейс командного рядка, що робить систему придатною до практичного використання й повністю відтворюваною.</w:t>
+        <w:t>— реалізовано REST-API та інтерфейс командного рядка, що робить систему придатною до практичного використання й повністю відтворюваною.</w:t>
       </w:r>
     </w:p>
     <w:p>
@@ -9720,7 +9650,19 @@
           <w:color w:val="000000"/>
           <w:sz w:val="28"/>
         </w:rPr>
-        <w:t>ДОДАТОК А. ЛІСТИНГИ КЛЮЧОВИХ МОДУЛІВ</w:t>
+        <w:t>ДОДАТОК А</w:t>
+      </w:r>
+      <w:r>
+        <w:br/>
+      </w:r>
+      <w:r>
+        <w:rPr>
+          <w:rFonts w:ascii="Times New Roman" w:hAnsi="Times New Roman" w:cs="Times New Roman"/>
+          <w:b/>
+          <w:color w:val="000000"/>
+          <w:sz w:val="28"/>
+        </w:rPr>
+        <w:t>Лістинги ключових модулів</w:t>
       </w:r>
     </w:p>
     <w:p>
@@ -10160,7 +10102,19 @@
           <w:color w:val="000000"/>
           <w:sz w:val="28"/>
         </w:rPr>
-        <w:t>ДОДАТОК Б. ДОДАТКОВІ МАТРИЦІ НЕВІДПОВІДНОСТЕЙ</w:t>
+        <w:t>ДОДАТОК Б</w:t>
+      </w:r>
+      <w:r>
+        <w:br/>
+      </w:r>
+      <w:r>
+        <w:rPr>
+          <w:rFonts w:ascii="Times New Roman" w:hAnsi="Times New Roman" w:cs="Times New Roman"/>
+          <w:b/>
+          <w:color w:val="000000"/>
+          <w:sz w:val="28"/>
+        </w:rPr>
+        <w:t>Додаткові матриці невідповідностей</w:t>
       </w:r>
     </w:p>
     <w:p>
@@ -10176,7 +10130,7 @@
           <w:i w:val="0"/>
           <w:sz w:val="28"/>
         </w:rPr>
-        <w:t>Для повноти наведено матриці невідповідностей решти моделей.</w:t>
+        <w:t>Для повноти на рисунках Б.1–Б.5 наведено матриці невідповідностей решти моделей.</w:t>
       </w:r>
     </w:p>
     <w:p>

</xml_diff>

<commit_message>
Render box diagrams with Graphviz (clean arrow routing)
The matplotlib architecture/hybrid/CNN diagrams had ugly center-to-center
arrows overlapping boxes. Switched those three to Graphviz (polyline
routing, edge-to-edge connectors); signal plots (PQRST, beat window) stay
in matplotlib. Rebuilt thesis .docx and defense .pptx with the new figures.

https://claude.ai/code/session_01S5qNwg7X8K6zJLh7vUsNoh
</commit_message>
<xml_diff>
--- a/thesis/Кваліфікаційна_робота_Макаренко.docx
+++ b/thesis/Кваліфікаційна_робота_Макаренко.docx
@@ -2403,7 +2403,7 @@
       <w:r>
         <w:drawing>
           <wp:inline xmlns:a="http://schemas.openxmlformats.org/drawingml/2006/main" xmlns:pic="http://schemas.openxmlformats.org/drawingml/2006/picture">
-            <wp:extent cx="5220000" cy="3896941"/>
+            <wp:extent cx="5220000" cy="4515648"/>
             <wp:docPr id="3" name="Picture 3"/>
             <wp:cNvGraphicFramePr>
               <a:graphicFrameLocks noChangeAspect="1"/>
@@ -2424,7 +2424,7 @@
                   <pic:spPr>
                     <a:xfrm>
                       <a:off x="0" y="0"/>
-                      <a:ext cx="5220000" cy="3896941"/>
+                      <a:ext cx="5220000" cy="4515648"/>
                     </a:xfrm>
                     <a:prstGeom prst="rect"/>
                   </pic:spPr>
@@ -3667,7 +3667,7 @@
       <w:r>
         <w:drawing>
           <wp:inline xmlns:a="http://schemas.openxmlformats.org/drawingml/2006/main" xmlns:pic="http://schemas.openxmlformats.org/drawingml/2006/picture">
-            <wp:extent cx="5400000" cy="1736109"/>
+            <wp:extent cx="5400000" cy="471245"/>
             <wp:docPr id="5" name="Picture 5"/>
             <wp:cNvGraphicFramePr>
               <a:graphicFrameLocks noChangeAspect="1"/>
@@ -3688,7 +3688,7 @@
                   <pic:spPr>
                     <a:xfrm>
                       <a:off x="0" y="0"/>
-                      <a:ext cx="5400000" cy="1736109"/>
+                      <a:ext cx="5400000" cy="471245"/>
                     </a:xfrm>
                     <a:prstGeom prst="rect"/>
                   </pic:spPr>
@@ -3869,7 +3869,7 @@
       <w:r>
         <w:drawing>
           <wp:inline xmlns:a="http://schemas.openxmlformats.org/drawingml/2006/main" xmlns:pic="http://schemas.openxmlformats.org/drawingml/2006/picture">
-            <wp:extent cx="5400000" cy="2757133"/>
+            <wp:extent cx="5400000" cy="781826"/>
             <wp:docPr id="6" name="Picture 6"/>
             <wp:cNvGraphicFramePr>
               <a:graphicFrameLocks noChangeAspect="1"/>
@@ -3890,7 +3890,7 @@
                   <pic:spPr>
                     <a:xfrm>
                       <a:off x="0" y="0"/>
-                      <a:ext cx="5400000" cy="2757133"/>
+                      <a:ext cx="5400000" cy="781826"/>
                     </a:xfrm>
                     <a:prstGeom prst="rect"/>
                   </pic:spPr>

</xml_diff>